<commit_message>
feat: added corretor autonomo on contracts
</commit_message>
<xml_diff>
--- a/src/templates/default-rental-application-contract.docx
+++ b/src/templates/default-rental-application-contract.docx
@@ -4,13 +4,13 @@
   <w:body>
     <w:p>
       <w:pPr>
-        <w:pStyle w:val="Corpo"/>
+        <w:pStyle w:val="Corpo A"/>
         <w:spacing w:after="40"/>
       </w:pPr>
     </w:p>
     <w:p>
       <w:pPr>
-        <w:pStyle w:val="Corpo"/>
+        <w:pStyle w:val="Corpo A"/>
         <w:spacing w:after="60"/>
         <w:jc w:val="center"/>
       </w:pPr>
@@ -74,7 +74,7 @@
     </w:p>
     <w:p>
       <w:pPr>
-        <w:pStyle w:val="Corpo"/>
+        <w:pStyle w:val="Corpo A"/>
         <w:spacing w:after="40"/>
         <w:jc w:val="center"/>
       </w:pPr>
@@ -138,7 +138,7 @@
     </w:p>
     <w:p>
       <w:pPr>
-        <w:pStyle w:val="Corpo"/>
+        <w:pStyle w:val="Corpo A"/>
         <w:spacing w:after="240"/>
         <w:jc w:val="center"/>
       </w:pPr>
@@ -154,7 +154,7 @@
     </w:p>
     <w:p>
       <w:pPr>
-        <w:pStyle w:val="Corpo"/>
+        <w:pStyle w:val="Corpo A"/>
       </w:pPr>
       <w:r>
         <w:rPr>
@@ -494,7 +494,7 @@
     </w:p>
     <w:p>
       <w:pPr>
-        <w:pStyle w:val="Corpo"/>
+        <w:pStyle w:val="Corpo A"/>
       </w:pPr>
       <w:r>
         <w:rPr>
@@ -603,7 +603,7 @@
     </w:p>
     <w:p>
       <w:pPr>
-        <w:pStyle w:val="Corpo"/>
+        <w:pStyle w:val="Corpo A"/>
       </w:pPr>
       <w:r>
         <w:rPr>
@@ -749,25 +749,28 @@
       <w:r>
         <w:rPr>
           <w:rtl w:val="0"/>
+          <w:lang w:val="en-US"/>
         </w:rPr>
         <w:t>QUADRO RESUMO DA CONTRATA</w:t>
       </w:r>
       <w:r>
         <w:rPr>
           <w:rtl w:val="0"/>
+          <w:lang w:val="en-US"/>
         </w:rPr>
         <w:t>ÇÃ</w:t>
       </w:r>
       <w:r>
         <w:rPr>
           <w:rtl w:val="0"/>
+          <w:lang w:val="en-US"/>
         </w:rPr>
         <w:t>O</w:t>
       </w:r>
     </w:p>
     <w:p>
       <w:pPr>
-        <w:pStyle w:val="Corpo"/>
+        <w:pStyle w:val="Corpo A"/>
         <w:keepNext w:val="1"/>
         <w:spacing w:after="40"/>
       </w:pPr>
@@ -832,7 +835,7 @@
       <w:tblPr>
         <w:tblW w:w="10370" w:type="dxa"/>
         <w:jc w:val="center"/>
-        <w:tblInd w:w="108" w:type="dxa"/>
+        <w:tblInd w:w="324" w:type="dxa"/>
         <w:tblBorders>
           <w:top w:val="single" w:color="ffffff" w:sz="8" w:space="0" w:shadow="0" w:frame="0"/>
           <w:left w:val="single" w:color="ffffff" w:sz="8" w:space="0" w:shadow="0" w:frame="0"/>
@@ -852,7 +855,7 @@
           <w:shd w:val="clear" w:color="auto" w:fill="ced7e7"/>
         </w:tblPrEx>
         <w:trPr>
-          <w:trHeight w:val="2020" w:hRule="atLeast"/>
+          <w:trHeight w:val="2070" w:hRule="atLeast"/>
         </w:trPr>
         <w:tc>
           <w:tcPr>
@@ -874,7 +877,7 @@
           </w:tcPr>
           <w:p>
             <w:pPr>
-              <w:pStyle w:val="Corpo"/>
+              <w:pStyle w:val="Corpo A"/>
               <w:spacing w:after="60"/>
               <w:rPr>
                 <w:shd w:val="nil" w:color="auto" w:fill="auto"/>
@@ -891,7 +894,7 @@
           </w:p>
           <w:p>
             <w:pPr>
-              <w:pStyle w:val="Corpo"/>
+              <w:pStyle w:val="Corpo A"/>
               <w:bidi w:val="0"/>
               <w:spacing w:after="60"/>
               <w:ind w:left="0" w:right="0" w:firstLine="0"/>
@@ -958,7 +961,7 @@
           </w:p>
           <w:p>
             <w:pPr>
-              <w:pStyle w:val="Corpo"/>
+              <w:pStyle w:val="Corpo A"/>
               <w:bidi w:val="0"/>
               <w:spacing w:after="60"/>
               <w:ind w:left="0" w:right="0" w:firstLine="0"/>
@@ -989,7 +992,7 @@
           </w:p>
           <w:p>
             <w:pPr>
-              <w:pStyle w:val="Corpo"/>
+              <w:pStyle w:val="Corpo A"/>
               <w:bidi w:val="0"/>
               <w:spacing w:after="60"/>
               <w:ind w:left="0" w:right="0" w:firstLine="0"/>
@@ -1020,7 +1023,7 @@
           </w:p>
           <w:p>
             <w:pPr>
-              <w:pStyle w:val="Corpo"/>
+              <w:pStyle w:val="Corpo A"/>
               <w:bidi w:val="0"/>
               <w:spacing w:after="60"/>
               <w:ind w:left="0" w:right="0" w:firstLine="0"/>
@@ -1051,7 +1054,7 @@
           </w:p>
           <w:p>
             <w:pPr>
-              <w:pStyle w:val="Corpo"/>
+              <w:pStyle w:val="Corpo A"/>
               <w:bidi w:val="0"/>
               <w:spacing w:after="60"/>
               <w:ind w:left="0" w:right="0" w:firstLine="0"/>
@@ -1082,7 +1085,7 @@
           </w:p>
           <w:p>
             <w:pPr>
-              <w:pStyle w:val="Corpo"/>
+              <w:pStyle w:val="Corpo A"/>
               <w:bidi w:val="0"/>
               <w:spacing w:after="60"/>
               <w:ind w:left="0" w:right="0" w:firstLine="0"/>
@@ -1105,7 +1108,27 @@
     </w:tbl>
     <w:p>
       <w:pPr>
-        <w:pStyle w:val="Corpo"/>
+        <w:pStyle w:val="Corpo A"/>
+        <w:keepNext w:val="1"/>
+        <w:widowControl w:val="0"/>
+        <w:spacing w:after="40" w:line="240" w:lineRule="auto"/>
+        <w:ind w:left="216" w:hanging="216"/>
+        <w:jc w:val="center"/>
+      </w:pPr>
+    </w:p>
+    <w:p>
+      <w:pPr>
+        <w:pStyle w:val="Corpo A"/>
+        <w:keepNext w:val="1"/>
+        <w:widowControl w:val="0"/>
+        <w:spacing w:after="40" w:line="240" w:lineRule="auto"/>
+        <w:ind w:left="108" w:hanging="108"/>
+        <w:jc w:val="center"/>
+      </w:pPr>
+    </w:p>
+    <w:p>
+      <w:pPr>
+        <w:pStyle w:val="Corpo A"/>
         <w:keepNext w:val="1"/>
         <w:widowControl w:val="0"/>
         <w:spacing w:after="40" w:line="240" w:lineRule="auto"/>
@@ -1114,7 +1137,7 @@
     </w:p>
     <w:p>
       <w:pPr>
-        <w:pStyle w:val="Corpo"/>
+        <w:pStyle w:val="Corpo A"/>
         <w:keepNext w:val="1"/>
         <w:spacing w:before="160" w:after="40"/>
       </w:pPr>
@@ -1128,58 +1151,21 @@
           <w:szCs w:val="20"/>
           <w:u w:color="1f4e79"/>
           <w:rtl w:val="0"/>
-          <w:lang w:val="en-US"/>
+          <w:lang w:val="pt-PT"/>
           <w14:textFill>
             <w14:solidFill>
               <w14:srgbClr w14:val="1F4E79"/>
             </w14:solidFill>
           </w14:textFill>
         </w:rPr>
-        <w:t>DADOS DA IMOBILI</w:t>
-      </w:r>
-      <w:r>
-        <w:rPr>
-          <w:b w:val="1"/>
-          <w:bCs w:val="1"/>
-          <w:outline w:val="0"/>
-          <w:color w:val="1f4e79"/>
-          <w:sz w:val="20"/>
-          <w:szCs w:val="20"/>
-          <w:u w:color="1f4e79"/>
-          <w:rtl w:val="0"/>
-          <w:lang w:val="en-US"/>
-          <w14:textFill>
-            <w14:solidFill>
-              <w14:srgbClr w14:val="1F4E79"/>
-            </w14:solidFill>
-          </w14:textFill>
-        </w:rPr>
-        <w:t>Á</w:t>
-      </w:r>
-      <w:r>
-        <w:rPr>
-          <w:b w:val="1"/>
-          <w:bCs w:val="1"/>
-          <w:outline w:val="0"/>
-          <w:color w:val="1f4e79"/>
-          <w:sz w:val="20"/>
-          <w:szCs w:val="20"/>
-          <w:u w:color="1f4e79"/>
-          <w:rtl w:val="0"/>
-          <w14:textFill>
-            <w14:solidFill>
-              <w14:srgbClr w14:val="1F4E79"/>
-            </w14:solidFill>
-          </w14:textFill>
-        </w:rPr>
-        <w:t>RIA</w:t>
+        <w:t>{partnerSectionTitle}</w:t>
       </w:r>
     </w:p>
     <w:tbl>
       <w:tblPr>
         <w:tblW w:w="10370" w:type="dxa"/>
         <w:jc w:val="center"/>
-        <w:tblInd w:w="108" w:type="dxa"/>
+        <w:tblInd w:w="324" w:type="dxa"/>
         <w:tblBorders>
           <w:top w:val="single" w:color="ffffff" w:sz="8" w:space="0" w:shadow="0" w:frame="0"/>
           <w:left w:val="single" w:color="ffffff" w:sz="8" w:space="0" w:shadow="0" w:frame="0"/>
@@ -1199,7 +1185,7 @@
           <w:shd w:val="clear" w:color="auto" w:fill="ced7e7"/>
         </w:tblPrEx>
         <w:trPr>
-          <w:trHeight w:val="1426" w:hRule="atLeast"/>
+          <w:trHeight w:val="2639" w:hRule="atLeast"/>
         </w:trPr>
         <w:tc>
           <w:tcPr>
@@ -1221,7 +1207,7 @@
           </w:tcPr>
           <w:p>
             <w:pPr>
-              <w:pStyle w:val="Corpo"/>
+              <w:pStyle w:val="Corpo A"/>
               <w:spacing w:after="60"/>
               <w:rPr>
                 <w:shd w:val="nil" w:color="auto" w:fill="auto"/>
@@ -1243,12 +1229,28 @@
                 <w:rtl w:val="0"/>
                 <w:lang w:val="en-US"/>
               </w:rPr>
-              <w:t>{realEstateName}</w:t>
+              <w:t>{</w:t>
+            </w:r>
+            <w:r>
+              <w:rPr>
+                <w:shd w:val="nil" w:color="auto" w:fill="auto"/>
+                <w:rtl w:val="0"/>
+                <w:lang w:val="pt-PT"/>
+              </w:rPr>
+              <w:t>partnerName</w:t>
+            </w:r>
+            <w:r>
+              <w:rPr>
+                <w:shd w:val="nil" w:color="auto" w:fill="auto"/>
+                <w:rtl w:val="0"/>
+                <w:lang w:val="en-US"/>
+              </w:rPr>
+              <w:t>}</w:t>
             </w:r>
           </w:p>
           <w:p>
             <w:pPr>
-              <w:pStyle w:val="Corpo"/>
+              <w:pStyle w:val="Corpo A"/>
               <w:bidi w:val="0"/>
               <w:spacing w:after="60"/>
               <w:ind w:left="0" w:right="0" w:firstLine="0"/>
@@ -1264,9 +1266,19 @@
                 <w:bCs w:val="1"/>
                 <w:shd w:val="nil" w:color="auto" w:fill="auto"/>
                 <w:rtl w:val="0"/>
+                <w:lang w:val="pt-PT"/>
+              </w:rPr>
+              <w:t>{partnerDocumentLabel}</w:t>
+            </w:r>
+            <w:r>
+              <w:rPr>
+                <w:b w:val="1"/>
+                <w:bCs w:val="1"/>
+                <w:shd w:val="nil" w:color="auto" w:fill="auto"/>
+                <w:rtl w:val="0"/>
                 <w:lang w:val="en-US"/>
               </w:rPr>
-              <w:t xml:space="preserve">CNPJ: </w:t>
+              <w:t xml:space="preserve">: </w:t>
             </w:r>
             <w:r>
               <w:rPr>
@@ -1274,12 +1286,201 @@
                 <w:rtl w:val="0"/>
                 <w:lang w:val="en-US"/>
               </w:rPr>
-              <w:t>{realEstateCnpj}</w:t>
+              <w:t>{</w:t>
+            </w:r>
+            <w:r>
+              <w:rPr>
+                <w:shd w:val="nil" w:color="auto" w:fill="auto"/>
+                <w:rtl w:val="0"/>
+                <w:lang w:val="pt-PT"/>
+              </w:rPr>
+              <w:t>partnerDocument</w:t>
+            </w:r>
+            <w:r>
+              <w:rPr>
+                <w:shd w:val="nil" w:color="auto" w:fill="auto"/>
+                <w:rtl w:val="0"/>
+                <w:lang w:val="en-US"/>
+              </w:rPr>
+              <w:t>}</w:t>
             </w:r>
           </w:p>
           <w:p>
             <w:pPr>
-              <w:pStyle w:val="Corpo"/>
+              <w:pStyle w:val="Corpo A"/>
+              <w:bidi w:val="0"/>
+              <w:spacing w:after="60"/>
+              <w:ind w:left="0" w:right="0" w:firstLine="0"/>
+              <w:jc w:val="left"/>
+              <w:rPr>
+                <w:shd w:val="nil" w:color="auto" w:fill="auto"/>
+                <w:rtl w:val="0"/>
+              </w:rPr>
+            </w:pPr>
+            <w:r>
+              <w:rPr>
+                <w:b w:val="1"/>
+                <w:bCs w:val="1"/>
+                <w:shd w:val="nil" w:color="auto" w:fill="auto"/>
+                <w:rtl w:val="0"/>
+                <w:lang w:val="pt-PT"/>
+              </w:rPr>
+              <w:t>Respons</w:t>
+            </w:r>
+            <w:r>
+              <w:rPr>
+                <w:b w:val="1"/>
+                <w:bCs w:val="1"/>
+                <w:shd w:val="nil" w:color="auto" w:fill="auto"/>
+                <w:rtl w:val="0"/>
+                <w:lang w:val="pt-PT"/>
+              </w:rPr>
+              <w:t>á</w:t>
+            </w:r>
+            <w:r>
+              <w:rPr>
+                <w:b w:val="1"/>
+                <w:bCs w:val="1"/>
+                <w:shd w:val="nil" w:color="auto" w:fill="auto"/>
+                <w:rtl w:val="0"/>
+                <w:lang w:val="pt-PT"/>
+              </w:rPr>
+              <w:t>vel</w:t>
+            </w:r>
+            <w:r>
+              <w:rPr>
+                <w:b w:val="1"/>
+                <w:bCs w:val="1"/>
+                <w:shd w:val="nil" w:color="auto" w:fill="auto"/>
+                <w:rtl w:val="0"/>
+                <w:lang w:val="en-US"/>
+              </w:rPr>
+              <w:t>:</w:t>
+            </w:r>
+            <w:r>
+              <w:rPr>
+                <w:b w:val="1"/>
+                <w:bCs w:val="1"/>
+                <w:shd w:val="nil" w:color="auto" w:fill="auto"/>
+                <w:rtl w:val="0"/>
+                <w:lang w:val="pt-PT"/>
+              </w:rPr>
+              <w:t xml:space="preserve"> </w:t>
+            </w:r>
+            <w:r>
+              <w:rPr>
+                <w:shd w:val="nil" w:color="auto" w:fill="auto"/>
+                <w:rtl w:val="0"/>
+                <w:lang w:val="en-US"/>
+              </w:rPr>
+              <w:t>{partnerResponsibleName}</w:t>
+            </w:r>
+          </w:p>
+          <w:p>
+            <w:pPr>
+              <w:pStyle w:val="Corpo A"/>
+              <w:bidi w:val="0"/>
+              <w:spacing w:after="60"/>
+              <w:ind w:left="0" w:right="0" w:firstLine="0"/>
+              <w:jc w:val="left"/>
+              <w:rPr>
+                <w:shd w:val="nil" w:color="auto" w:fill="auto"/>
+                <w:rtl w:val="0"/>
+              </w:rPr>
+            </w:pPr>
+            <w:r>
+              <w:rPr>
+                <w:b w:val="1"/>
+                <w:bCs w:val="1"/>
+                <w:shd w:val="nil" w:color="auto" w:fill="auto"/>
+                <w:rtl w:val="0"/>
+                <w:lang w:val="pt-PT"/>
+              </w:rPr>
+              <w:t>Telefone</w:t>
+            </w:r>
+            <w:r>
+              <w:rPr>
+                <w:b w:val="1"/>
+                <w:bCs w:val="1"/>
+                <w:shd w:val="nil" w:color="auto" w:fill="auto"/>
+                <w:rtl w:val="0"/>
+                <w:lang w:val="en-US"/>
+              </w:rPr>
+              <w:t>:</w:t>
+            </w:r>
+            <w:r>
+              <w:rPr>
+                <w:b w:val="1"/>
+                <w:bCs w:val="1"/>
+                <w:shd w:val="nil" w:color="auto" w:fill="auto"/>
+                <w:rtl w:val="0"/>
+                <w:lang w:val="pt-PT"/>
+              </w:rPr>
+              <w:t xml:space="preserve"> </w:t>
+            </w:r>
+            <w:r>
+              <w:rPr>
+                <w:shd w:val="nil" w:color="auto" w:fill="auto"/>
+                <w:rtl w:val="0"/>
+                <w:lang w:val="en-US"/>
+              </w:rPr>
+              <w:t>{partnerPhone}</w:t>
+            </w:r>
+          </w:p>
+          <w:p>
+            <w:pPr>
+              <w:pStyle w:val="Corpo A"/>
+              <w:bidi w:val="0"/>
+              <w:spacing w:after="60"/>
+              <w:ind w:left="0" w:right="0" w:firstLine="0"/>
+              <w:jc w:val="left"/>
+              <w:rPr>
+                <w:shd w:val="nil" w:color="auto" w:fill="auto"/>
+                <w:rtl w:val="0"/>
+              </w:rPr>
+            </w:pPr>
+            <w:r>
+              <w:rPr>
+                <w:b w:val="1"/>
+                <w:bCs w:val="1"/>
+                <w:shd w:val="nil" w:color="auto" w:fill="auto"/>
+                <w:rtl w:val="0"/>
+                <w:lang w:val="pt-PT"/>
+              </w:rPr>
+              <w:t>E-mail</w:t>
+            </w:r>
+            <w:r>
+              <w:rPr>
+                <w:b w:val="1"/>
+                <w:bCs w:val="1"/>
+                <w:shd w:val="nil" w:color="auto" w:fill="auto"/>
+                <w:rtl w:val="0"/>
+                <w:lang w:val="en-US"/>
+              </w:rPr>
+              <w:t>:</w:t>
+            </w:r>
+            <w:r>
+              <w:rPr>
+                <w:b w:val="1"/>
+                <w:bCs w:val="1"/>
+                <w:shd w:val="nil" w:color="auto" w:fill="auto"/>
+                <w:rtl w:val="0"/>
+                <w:lang w:val="pt-PT"/>
+              </w:rPr>
+              <w:t xml:space="preserve"> </w:t>
+            </w:r>
+            <w:r>
+              <w:rPr>
+                <w:shd w:val="nil" w:color="auto" w:fill="auto"/>
+                <w:rtl w:val="0"/>
+                <w:lang w:val="en-US"/>
+              </w:rPr>
+              <w:t>{partnerEmail}</w:t>
+            </w:r>
+          </w:p>
+          <w:p>
+            <w:pPr>
+              <w:pStyle w:val="Corpo A"/>
               <w:bidi w:val="0"/>
               <w:spacing w:after="60"/>
               <w:ind w:left="0" w:right="0" w:firstLine="0"/>
@@ -1325,7 +1526,7 @@
                 <w:rtl w:val="0"/>
                 <w:lang w:val="en-US"/>
               </w:rPr>
-              <w:t>{realEstateStreet}, n</w:t>
+              <w:t>{partnerStreet}, n</w:t>
             </w:r>
             <w:r>
               <w:rPr>
@@ -1341,12 +1542,73 @@
                 <w:rtl w:val="0"/>
                 <w:lang w:val="en-US"/>
               </w:rPr>
-              <w:t>{realEstateNumber} {realEstateComplement}</w:t>
+              <w:t>{partnerNumber} {</w:t>
+            </w:r>
+            <w:r>
+              <w:rPr>
+                <w:shd w:val="nil" w:color="auto" w:fill="auto"/>
+                <w:rtl w:val="0"/>
+                <w:lang w:val="pt-PT"/>
+              </w:rPr>
+              <w:t>partner</w:t>
+            </w:r>
+            <w:r>
+              <w:rPr>
+                <w:shd w:val="nil" w:color="auto" w:fill="auto"/>
+                <w:rtl w:val="0"/>
+                <w:lang w:val="en-US"/>
+              </w:rPr>
+              <w:t>Complement}</w:t>
             </w:r>
           </w:p>
           <w:p>
             <w:pPr>
-              <w:pStyle w:val="Corpo"/>
+              <w:pStyle w:val="Corpo A"/>
+              <w:bidi w:val="0"/>
+              <w:spacing w:after="60"/>
+              <w:ind w:left="0" w:right="0" w:firstLine="0"/>
+              <w:jc w:val="left"/>
+              <w:rPr>
+                <w:b w:val="1"/>
+                <w:bCs w:val="1"/>
+                <w:shd w:val="nil" w:color="auto" w:fill="auto"/>
+                <w:rtl w:val="0"/>
+              </w:rPr>
+            </w:pPr>
+            <w:r>
+              <w:rPr>
+                <w:b w:val="1"/>
+                <w:bCs w:val="1"/>
+                <w:shd w:val="nil" w:color="auto" w:fill="auto"/>
+                <w:rtl w:val="0"/>
+                <w:lang w:val="en-US"/>
+              </w:rPr>
+              <w:t>Bairro</w:t>
+            </w:r>
+            <w:r>
+              <w:rPr>
+                <w:b w:val="1"/>
+                <w:bCs w:val="1"/>
+                <w:shd w:val="nil" w:color="auto" w:fill="auto"/>
+                <w:rtl w:val="0"/>
+                <w:lang w:val="pt-PT"/>
+              </w:rPr>
+              <w:t xml:space="preserve">: </w:t>
+            </w:r>
+            <w:r>
+              <w:rPr>
+                <w:b w:val="0"/>
+                <w:bCs w:val="0"/>
+                <w:shd w:val="nil" w:color="auto" w:fill="auto"/>
+                <w:rtl w:val="0"/>
+                <w:lang w:val="en-US"/>
+              </w:rPr>
+              <w:t>{partnerNeighborhood}</w:t>
+            </w:r>
+          </w:p>
+          <w:p>
+            <w:pPr>
+              <w:pStyle w:val="Corpo A"/>
               <w:bidi w:val="0"/>
               <w:spacing w:after="60"/>
               <w:ind w:left="0" w:right="0" w:firstLine="0"/>
@@ -1364,7 +1626,7 @@
                 <w:rtl w:val="0"/>
                 <w:lang w:val="en-US"/>
               </w:rPr>
-              <w:t xml:space="preserve">Bairro/Cidade/UF: </w:t>
+              <w:t xml:space="preserve">Cidade/UF: </w:t>
             </w:r>
             <w:r>
               <w:rPr>
@@ -1372,12 +1634,12 @@
                 <w:rtl w:val="0"/>
                 <w:lang w:val="en-US"/>
               </w:rPr>
-              <w:t>{realEstateNeighborhood}. {realEstateCity}, {realEstateState}</w:t>
+              <w:t>{partnerCity}, {partnerState}</w:t>
             </w:r>
           </w:p>
           <w:p>
             <w:pPr>
-              <w:pStyle w:val="Corpo"/>
+              <w:pStyle w:val="Corpo A"/>
               <w:bidi w:val="0"/>
               <w:spacing w:after="60"/>
               <w:ind w:left="0" w:right="0" w:firstLine="0"/>
@@ -1402,7 +1664,7 @@
                 <w:rtl w:val="0"/>
                 <w:lang w:val="en-US"/>
               </w:rPr>
-              <w:t>{realEstateZipCode}</w:t>
+              <w:t>{partnerZipCode}</w:t>
             </w:r>
           </w:p>
         </w:tc>
@@ -1410,7 +1672,27 @@
     </w:tbl>
     <w:p>
       <w:pPr>
-        <w:pStyle w:val="Corpo"/>
+        <w:pStyle w:val="Corpo A"/>
+        <w:keepNext w:val="1"/>
+        <w:widowControl w:val="0"/>
+        <w:spacing w:before="160" w:after="40" w:line="240" w:lineRule="auto"/>
+        <w:ind w:left="216" w:hanging="216"/>
+        <w:jc w:val="center"/>
+      </w:pPr>
+    </w:p>
+    <w:p>
+      <w:pPr>
+        <w:pStyle w:val="Corpo A"/>
+        <w:keepNext w:val="1"/>
+        <w:widowControl w:val="0"/>
+        <w:spacing w:before="160" w:after="40" w:line="240" w:lineRule="auto"/>
+        <w:ind w:left="108" w:hanging="108"/>
+        <w:jc w:val="center"/>
+      </w:pPr>
+    </w:p>
+    <w:p>
+      <w:pPr>
+        <w:pStyle w:val="Corpo A"/>
         <w:keepNext w:val="1"/>
         <w:widowControl w:val="0"/>
         <w:spacing w:before="160" w:after="40" w:line="240" w:lineRule="auto"/>
@@ -1419,12 +1701,12 @@
     </w:p>
     <w:p>
       <w:pPr>
-        <w:pStyle w:val="Corpo"/>
-      </w:pPr>
-    </w:p>
-    <w:p>
-      <w:pPr>
-        <w:pStyle w:val="Corpo"/>
+        <w:pStyle w:val="Corpo A"/>
+      </w:pPr>
+    </w:p>
+    <w:p>
+      <w:pPr>
+        <w:pStyle w:val="Corpo A"/>
       </w:pPr>
       <w:r>
         <w:rPr>
@@ -1439,7 +1721,7 @@
     </w:p>
     <w:p>
       <w:pPr>
-        <w:pStyle w:val="Corpo"/>
+        <w:pStyle w:val="Corpo A"/>
         <w:keepNext w:val="1"/>
         <w:spacing w:after="40"/>
       </w:pPr>
@@ -1505,7 +1787,7 @@
       <w:tblPr>
         <w:tblW w:w="10370" w:type="dxa"/>
         <w:jc w:val="center"/>
-        <w:tblInd w:w="108" w:type="dxa"/>
+        <w:tblInd w:w="324" w:type="dxa"/>
         <w:tblBorders>
           <w:top w:val="single" w:color="ffffff" w:sz="8" w:space="0" w:shadow="0" w:frame="0"/>
           <w:left w:val="single" w:color="ffffff" w:sz="8" w:space="0" w:shadow="0" w:frame="0"/>
@@ -1525,7 +1807,7 @@
           <w:shd w:val="clear" w:color="auto" w:fill="ced7e7"/>
         </w:tblPrEx>
         <w:trPr>
-          <w:trHeight w:val="1130" w:hRule="atLeast"/>
+          <w:trHeight w:val="1180" w:hRule="atLeast"/>
         </w:trPr>
         <w:tc>
           <w:tcPr>
@@ -1547,7 +1829,7 @@
           </w:tcPr>
           <w:p>
             <w:pPr>
-              <w:pStyle w:val="Corpo"/>
+              <w:pStyle w:val="Corpo A"/>
               <w:spacing w:after="60"/>
               <w:rPr>
                 <w:shd w:val="nil" w:color="auto" w:fill="auto"/>
@@ -1574,7 +1856,7 @@
           </w:p>
           <w:p>
             <w:pPr>
-              <w:pStyle w:val="Corpo"/>
+              <w:pStyle w:val="Corpo A"/>
               <w:bidi w:val="0"/>
               <w:spacing w:after="60"/>
               <w:ind w:left="0" w:right="0" w:firstLine="0"/>
@@ -1641,7 +1923,7 @@
           </w:p>
           <w:p>
             <w:pPr>
-              <w:pStyle w:val="Corpo"/>
+              <w:pStyle w:val="Corpo A"/>
               <w:bidi w:val="0"/>
               <w:spacing w:after="60"/>
               <w:ind w:left="0" w:right="0" w:firstLine="0"/>
@@ -1672,7 +1954,7 @@
           </w:p>
           <w:p>
             <w:pPr>
-              <w:pStyle w:val="Corpo"/>
+              <w:pStyle w:val="Corpo A"/>
               <w:bidi w:val="0"/>
               <w:spacing w:after="60"/>
               <w:ind w:left="0" w:right="0" w:firstLine="0"/>
@@ -1705,7 +1987,27 @@
     </w:tbl>
     <w:p>
       <w:pPr>
-        <w:pStyle w:val="Corpo"/>
+        <w:pStyle w:val="Corpo A"/>
+        <w:keepNext w:val="1"/>
+        <w:widowControl w:val="0"/>
+        <w:spacing w:after="40" w:line="240" w:lineRule="auto"/>
+        <w:ind w:left="216" w:hanging="216"/>
+        <w:jc w:val="center"/>
+      </w:pPr>
+    </w:p>
+    <w:p>
+      <w:pPr>
+        <w:pStyle w:val="Corpo A"/>
+        <w:keepNext w:val="1"/>
+        <w:widowControl w:val="0"/>
+        <w:spacing w:after="40" w:line="240" w:lineRule="auto"/>
+        <w:ind w:left="108" w:hanging="108"/>
+        <w:jc w:val="center"/>
+      </w:pPr>
+    </w:p>
+    <w:p>
+      <w:pPr>
+        <w:pStyle w:val="Corpo A"/>
         <w:keepNext w:val="1"/>
         <w:widowControl w:val="0"/>
         <w:spacing w:after="40" w:line="240" w:lineRule="auto"/>
@@ -1714,7 +2016,7 @@
     </w:p>
     <w:p>
       <w:pPr>
-        <w:pStyle w:val="Corpo"/>
+        <w:pStyle w:val="Corpo A"/>
         <w:keepNext w:val="1"/>
         <w:spacing w:before="160"/>
       </w:pPr>
@@ -1778,7 +2080,7 @@
       <w:tblPr>
         <w:tblW w:w="10370" w:type="dxa"/>
         <w:jc w:val="center"/>
-        <w:tblInd w:w="108" w:type="dxa"/>
+        <w:tblInd w:w="324" w:type="dxa"/>
         <w:tblBorders>
           <w:top w:val="single" w:color="ffffff" w:sz="8" w:space="0" w:shadow="0" w:frame="0"/>
           <w:left w:val="single" w:color="ffffff" w:sz="8" w:space="0" w:shadow="0" w:frame="0"/>
@@ -1799,7 +2101,7 @@
           <w:shd w:val="clear" w:color="auto" w:fill="ced7e7"/>
         </w:tblPrEx>
         <w:trPr>
-          <w:trHeight w:val="234" w:hRule="atLeast"/>
+          <w:trHeight w:val="274" w:hRule="atLeast"/>
         </w:trPr>
         <w:tc>
           <w:tcPr>
@@ -1821,7 +2123,7 @@
           </w:tcPr>
           <w:p>
             <w:pPr>
-              <w:pStyle w:val="Corpo"/>
+              <w:pStyle w:val="Corpo A"/>
               <w:spacing w:after="60"/>
             </w:pPr>
             <w:r>
@@ -1856,7 +2158,7 @@
           </w:tcPr>
           <w:p>
             <w:pPr>
-              <w:pStyle w:val="Corpo"/>
+              <w:pStyle w:val="Corpo A"/>
               <w:spacing w:after="60"/>
             </w:pPr>
             <w:r>
@@ -1875,7 +2177,7 @@
           <w:shd w:val="clear" w:color="auto" w:fill="ced7e7"/>
         </w:tblPrEx>
         <w:trPr>
-          <w:trHeight w:val="234" w:hRule="atLeast"/>
+          <w:trHeight w:val="274" w:hRule="atLeast"/>
         </w:trPr>
         <w:tc>
           <w:tcPr>
@@ -1897,7 +2199,7 @@
           </w:tcPr>
           <w:p>
             <w:pPr>
-              <w:pStyle w:val="Corpo"/>
+              <w:pStyle w:val="Corpo A"/>
               <w:spacing w:after="60"/>
             </w:pPr>
             <w:r>
@@ -1932,7 +2234,7 @@
           </w:tcPr>
           <w:p>
             <w:pPr>
-              <w:pStyle w:val="Corpo"/>
+              <w:pStyle w:val="Corpo A"/>
               <w:spacing w:after="60"/>
             </w:pPr>
             <w:r>
@@ -1967,7 +2269,7 @@
           <w:shd w:val="clear" w:color="auto" w:fill="ced7e7"/>
         </w:tblPrEx>
         <w:trPr>
-          <w:trHeight w:val="234" w:hRule="atLeast"/>
+          <w:trHeight w:val="274" w:hRule="atLeast"/>
         </w:trPr>
         <w:tc>
           <w:tcPr>
@@ -1989,7 +2291,7 @@
           </w:tcPr>
           <w:p>
             <w:pPr>
-              <w:pStyle w:val="Corpo"/>
+              <w:pStyle w:val="Corpo A"/>
               <w:spacing w:after="60"/>
             </w:pPr>
             <w:r>
@@ -2044,7 +2346,7 @@
           </w:tcPr>
           <w:p>
             <w:pPr>
-              <w:pStyle w:val="Corpo"/>
+              <w:pStyle w:val="Corpo A"/>
               <w:spacing w:after="60"/>
             </w:pPr>
             <w:r>
@@ -2063,7 +2365,7 @@
           <w:shd w:val="clear" w:color="auto" w:fill="ced7e7"/>
         </w:tblPrEx>
         <w:trPr>
-          <w:trHeight w:val="234" w:hRule="atLeast"/>
+          <w:trHeight w:val="274" w:hRule="atLeast"/>
         </w:trPr>
         <w:tc>
           <w:tcPr>
@@ -2085,7 +2387,7 @@
           </w:tcPr>
           <w:p>
             <w:pPr>
-              <w:pStyle w:val="Corpo"/>
+              <w:pStyle w:val="Corpo A"/>
               <w:spacing w:after="60"/>
             </w:pPr>
             <w:r>
@@ -2140,7 +2442,7 @@
           </w:tcPr>
           <w:p>
             <w:pPr>
-              <w:pStyle w:val="Corpo"/>
+              <w:pStyle w:val="Corpo A"/>
               <w:spacing w:after="60"/>
             </w:pPr>
             <w:r>
@@ -2159,7 +2461,7 @@
           <w:shd w:val="clear" w:color="auto" w:fill="ced7e7"/>
         </w:tblPrEx>
         <w:trPr>
-          <w:trHeight w:val="234" w:hRule="atLeast"/>
+          <w:trHeight w:val="274" w:hRule="atLeast"/>
         </w:trPr>
         <w:tc>
           <w:tcPr>
@@ -2181,7 +2483,7 @@
           </w:tcPr>
           <w:p>
             <w:pPr>
-              <w:pStyle w:val="Corpo"/>
+              <w:pStyle w:val="Corpo A"/>
               <w:spacing w:after="60"/>
             </w:pPr>
             <w:r>
@@ -2236,7 +2538,7 @@
           </w:tcPr>
           <w:p>
             <w:pPr>
-              <w:pStyle w:val="Corpo"/>
+              <w:pStyle w:val="Corpo A"/>
               <w:spacing w:after="60"/>
             </w:pPr>
             <w:r>
@@ -2255,7 +2557,7 @@
           <w:shd w:val="clear" w:color="auto" w:fill="ced7e7"/>
         </w:tblPrEx>
         <w:trPr>
-          <w:trHeight w:val="234" w:hRule="atLeast"/>
+          <w:trHeight w:val="274" w:hRule="atLeast"/>
         </w:trPr>
         <w:tc>
           <w:tcPr>
@@ -2277,7 +2579,7 @@
           </w:tcPr>
           <w:p>
             <w:pPr>
-              <w:pStyle w:val="Corpo"/>
+              <w:pStyle w:val="Corpo A"/>
               <w:spacing w:after="60"/>
             </w:pPr>
             <w:r>
@@ -2332,7 +2634,7 @@
           </w:tcPr>
           <w:p>
             <w:pPr>
-              <w:pStyle w:val="Corpo"/>
+              <w:pStyle w:val="Corpo A"/>
               <w:spacing w:after="60"/>
             </w:pPr>
             <w:r>
@@ -2349,7 +2651,27 @@
     </w:tbl>
     <w:p>
       <w:pPr>
-        <w:pStyle w:val="Corpo"/>
+        <w:pStyle w:val="Corpo A"/>
+        <w:keepNext w:val="1"/>
+        <w:widowControl w:val="0"/>
+        <w:spacing w:before="160" w:line="240" w:lineRule="auto"/>
+        <w:ind w:left="216" w:hanging="216"/>
+        <w:jc w:val="center"/>
+      </w:pPr>
+    </w:p>
+    <w:p>
+      <w:pPr>
+        <w:pStyle w:val="Corpo A"/>
+        <w:keepNext w:val="1"/>
+        <w:widowControl w:val="0"/>
+        <w:spacing w:before="160" w:line="240" w:lineRule="auto"/>
+        <w:ind w:left="108" w:hanging="108"/>
+        <w:jc w:val="center"/>
+      </w:pPr>
+    </w:p>
+    <w:p>
+      <w:pPr>
+        <w:pStyle w:val="Corpo A"/>
         <w:keepNext w:val="1"/>
         <w:widowControl w:val="0"/>
         <w:spacing w:before="160" w:line="240" w:lineRule="auto"/>
@@ -2365,13 +2687,14 @@
           <w:b w:val="0"/>
           <w:bCs w:val="0"/>
           <w:rtl w:val="0"/>
+          <w:lang w:val="en-US"/>
         </w:rPr>
         <w:t>1. OBJETO</w:t>
       </w:r>
     </w:p>
     <w:p>
       <w:pPr>
-        <w:pStyle w:val="Corpo"/>
+        <w:pStyle w:val="Corpo A"/>
         <w:spacing w:after="60"/>
       </w:pPr>
       <w:r>
@@ -2482,7 +2805,7 @@
     </w:p>
     <w:p>
       <w:pPr>
-        <w:pStyle w:val="Corpo"/>
+        <w:pStyle w:val="Corpo A"/>
         <w:spacing w:after="60"/>
       </w:pPr>
       <w:r>
@@ -2579,7 +2902,7 @@
     </w:p>
     <w:p>
       <w:pPr>
-        <w:pStyle w:val="Corpo"/>
+        <w:pStyle w:val="Corpo A"/>
         <w:spacing w:after="60"/>
       </w:pPr>
       <w:r>
@@ -2718,7 +3041,7 @@
     </w:p>
     <w:p>
       <w:pPr>
-        <w:pStyle w:val="Corpo"/>
+        <w:pStyle w:val="Corpo A"/>
         <w:spacing w:after="60"/>
       </w:pPr>
       <w:r>
@@ -2822,6 +3145,7 @@
           <w:b w:val="0"/>
           <w:bCs w:val="0"/>
           <w:rtl w:val="0"/>
+          <w:lang w:val="en-US"/>
         </w:rPr>
         <w:t>2. CONDI</w:t>
       </w:r>
@@ -2864,7 +3188,7 @@
     </w:p>
     <w:p>
       <w:pPr>
-        <w:pStyle w:val="Corpo"/>
+        <w:pStyle w:val="Corpo A"/>
         <w:spacing w:after="60"/>
       </w:pPr>
       <w:r>
@@ -2932,7 +3256,7 @@
     </w:p>
     <w:p>
       <w:pPr>
-        <w:pStyle w:val="Corpo"/>
+        <w:pStyle w:val="Corpo A"/>
         <w:spacing w:after="60"/>
         <w:ind w:left="227" w:firstLine="0"/>
       </w:pPr>
@@ -2974,7 +3298,7 @@
     </w:p>
     <w:p>
       <w:pPr>
-        <w:pStyle w:val="Corpo"/>
+        <w:pStyle w:val="Corpo A"/>
         <w:spacing w:after="60"/>
         <w:ind w:left="227" w:firstLine="0"/>
       </w:pPr>
@@ -3016,7 +3340,7 @@
     </w:p>
     <w:p>
       <w:pPr>
-        <w:pStyle w:val="Corpo"/>
+        <w:pStyle w:val="Corpo A"/>
         <w:spacing w:after="60"/>
         <w:ind w:left="227" w:firstLine="0"/>
       </w:pPr>
@@ -3044,7 +3368,7 @@
     </w:p>
     <w:p>
       <w:pPr>
-        <w:pStyle w:val="Corpo"/>
+        <w:pStyle w:val="Corpo A"/>
         <w:spacing w:after="60"/>
         <w:ind w:left="227" w:firstLine="0"/>
       </w:pPr>
@@ -3114,7 +3438,7 @@
     </w:p>
     <w:p>
       <w:pPr>
-        <w:pStyle w:val="Corpo"/>
+        <w:pStyle w:val="Corpo A"/>
         <w:spacing w:after="60"/>
         <w:ind w:left="227" w:firstLine="0"/>
       </w:pPr>
@@ -3128,7 +3452,7 @@
     </w:p>
     <w:p>
       <w:pPr>
-        <w:pStyle w:val="Corpo"/>
+        <w:pStyle w:val="Corpo A"/>
         <w:spacing w:after="60"/>
         <w:ind w:left="227" w:firstLine="0"/>
       </w:pPr>
@@ -3170,7 +3494,7 @@
     </w:p>
     <w:p>
       <w:pPr>
-        <w:pStyle w:val="Corpo"/>
+        <w:pStyle w:val="Corpo A"/>
         <w:spacing w:after="60"/>
       </w:pPr>
       <w:r>
@@ -3253,7 +3577,7 @@
     </w:p>
     <w:p>
       <w:pPr>
-        <w:pStyle w:val="Corpo"/>
+        <w:pStyle w:val="Corpo A"/>
         <w:spacing w:after="60"/>
       </w:pPr>
       <w:r>
@@ -3385,6 +3709,7 @@
           <w:b w:val="0"/>
           <w:bCs w:val="0"/>
           <w:rtl w:val="0"/>
+          <w:lang w:val="en-US"/>
         </w:rPr>
         <w:t>3. DECLARA</w:t>
       </w:r>
@@ -3420,13 +3745,14 @@
           <w:b w:val="0"/>
           <w:bCs w:val="0"/>
           <w:rtl w:val="0"/>
+          <w:lang w:val="en-US"/>
         </w:rPr>
         <w:t>RIO</w:t>
       </w:r>
     </w:p>
     <w:p>
       <w:pPr>
-        <w:pStyle w:val="Corpo"/>
+        <w:pStyle w:val="Corpo A"/>
         <w:spacing w:after="60"/>
       </w:pPr>
       <w:r>
@@ -3522,7 +3848,7 @@
     </w:p>
     <w:p>
       <w:pPr>
-        <w:pStyle w:val="Corpo"/>
+        <w:pStyle w:val="Corpo A"/>
         <w:spacing w:after="60"/>
       </w:pPr>
       <w:r>
@@ -3618,7 +3944,7 @@
     </w:p>
     <w:p>
       <w:pPr>
-        <w:pStyle w:val="Corpo"/>
+        <w:pStyle w:val="Corpo A"/>
         <w:spacing w:after="60"/>
       </w:pPr>
       <w:r>
@@ -3764,6 +4090,7 @@
           <w:b w:val="0"/>
           <w:bCs w:val="0"/>
           <w:rtl w:val="0"/>
+          <w:lang w:val="en-US"/>
         </w:rPr>
         <w:t>4. OBRIGA</w:t>
       </w:r>
@@ -3788,7 +4115,7 @@
     </w:p>
     <w:p>
       <w:pPr>
-        <w:pStyle w:val="Corpo"/>
+        <w:pStyle w:val="Corpo A"/>
         <w:spacing w:after="60"/>
       </w:pPr>
       <w:r>
@@ -3871,7 +4198,7 @@
     </w:p>
     <w:p>
       <w:pPr>
-        <w:pStyle w:val="Corpo"/>
+        <w:pStyle w:val="Corpo A"/>
         <w:spacing w:after="60"/>
       </w:pPr>
       <w:r>
@@ -3982,7 +4309,7 @@
     </w:p>
     <w:p>
       <w:pPr>
-        <w:pStyle w:val="Corpo"/>
+        <w:pStyle w:val="Corpo A"/>
         <w:spacing w:after="60"/>
       </w:pPr>
       <w:r>
@@ -4064,7 +4391,7 @@
     </w:p>
     <w:p>
       <w:pPr>
-        <w:pStyle w:val="Corpo"/>
+        <w:pStyle w:val="Corpo A"/>
         <w:spacing w:after="60"/>
       </w:pPr>
       <w:r>
@@ -4196,6 +4523,7 @@
           <w:b w:val="0"/>
           <w:bCs w:val="0"/>
           <w:rtl w:val="0"/>
+          <w:lang w:val="en-US"/>
         </w:rPr>
         <w:t>5. OBRIGA</w:t>
       </w:r>
@@ -4231,13 +4559,14 @@
           <w:b w:val="0"/>
           <w:bCs w:val="0"/>
           <w:rtl w:val="0"/>
+          <w:lang w:val="en-US"/>
         </w:rPr>
         <w:t>RIO</w:t>
       </w:r>
     </w:p>
     <w:p>
       <w:pPr>
-        <w:pStyle w:val="Corpo"/>
+        <w:pStyle w:val="Corpo A"/>
         <w:spacing w:after="60"/>
       </w:pPr>
       <w:r>
@@ -4278,7 +4607,7 @@
     </w:p>
     <w:p>
       <w:pPr>
-        <w:pStyle w:val="Corpo"/>
+        <w:pStyle w:val="Corpo A"/>
         <w:spacing w:after="60"/>
         <w:ind w:left="227" w:firstLine="0"/>
       </w:pPr>
@@ -4306,7 +4635,7 @@
     </w:p>
     <w:p>
       <w:pPr>
-        <w:pStyle w:val="Corpo"/>
+        <w:pStyle w:val="Corpo A"/>
         <w:spacing w:after="60"/>
         <w:ind w:left="227" w:firstLine="0"/>
       </w:pPr>
@@ -4334,7 +4663,7 @@
     </w:p>
     <w:p>
       <w:pPr>
-        <w:pStyle w:val="Corpo"/>
+        <w:pStyle w:val="Corpo A"/>
         <w:spacing w:after="60"/>
         <w:ind w:left="227" w:firstLine="0"/>
       </w:pPr>
@@ -4348,7 +4677,7 @@
     </w:p>
     <w:p>
       <w:pPr>
-        <w:pStyle w:val="Corpo"/>
+        <w:pStyle w:val="Corpo A"/>
         <w:spacing w:after="60"/>
         <w:ind w:left="227" w:firstLine="0"/>
       </w:pPr>
@@ -4376,7 +4705,7 @@
     </w:p>
     <w:p>
       <w:pPr>
-        <w:pStyle w:val="Corpo"/>
+        <w:pStyle w:val="Corpo A"/>
         <w:spacing w:after="60"/>
         <w:ind w:left="227" w:firstLine="0"/>
       </w:pPr>
@@ -4404,7 +4733,7 @@
     </w:p>
     <w:p>
       <w:pPr>
-        <w:pStyle w:val="Corpo"/>
+        <w:pStyle w:val="Corpo A"/>
         <w:spacing w:after="60"/>
         <w:ind w:left="227" w:firstLine="0"/>
       </w:pPr>
@@ -4432,7 +4761,7 @@
     </w:p>
     <w:p>
       <w:pPr>
-        <w:pStyle w:val="Corpo"/>
+        <w:pStyle w:val="Corpo A"/>
         <w:spacing w:after="60"/>
         <w:ind w:left="227" w:firstLine="0"/>
       </w:pPr>
@@ -4460,7 +4789,7 @@
     </w:p>
     <w:p>
       <w:pPr>
-        <w:pStyle w:val="Corpo"/>
+        <w:pStyle w:val="Corpo A"/>
         <w:spacing w:after="60"/>
         <w:ind w:left="227" w:firstLine="0"/>
       </w:pPr>
@@ -4474,7 +4803,7 @@
     </w:p>
     <w:p>
       <w:pPr>
-        <w:pStyle w:val="Corpo"/>
+        <w:pStyle w:val="Corpo A"/>
         <w:spacing w:after="60"/>
         <w:ind w:left="227" w:firstLine="0"/>
       </w:pPr>
@@ -4529,7 +4858,7 @@
     </w:p>
     <w:p>
       <w:pPr>
-        <w:pStyle w:val="Corpo"/>
+        <w:pStyle w:val="Corpo A"/>
         <w:spacing w:after="60"/>
         <w:ind w:left="227" w:firstLine="0"/>
       </w:pPr>
@@ -4543,7 +4872,7 @@
     </w:p>
     <w:p>
       <w:pPr>
-        <w:pStyle w:val="Corpo"/>
+        <w:pStyle w:val="Corpo A"/>
         <w:spacing w:after="60"/>
       </w:pPr>
       <w:r>
@@ -4633,6 +4962,7 @@
           <w:b w:val="0"/>
           <w:bCs w:val="0"/>
           <w:rtl w:val="0"/>
+          <w:lang w:val="en-US"/>
         </w:rPr>
         <w:t>6. OBRIGA</w:t>
       </w:r>
@@ -4668,13 +4998,14 @@
           <w:b w:val="0"/>
           <w:bCs w:val="0"/>
           <w:rtl w:val="0"/>
+          <w:lang w:val="en-US"/>
         </w:rPr>
         <w:t>RIA</w:t>
       </w:r>
     </w:p>
     <w:p>
       <w:pPr>
-        <w:pStyle w:val="Corpo"/>
+        <w:pStyle w:val="Corpo A"/>
         <w:spacing w:after="60"/>
       </w:pPr>
       <w:r>
@@ -4729,7 +5060,7 @@
     </w:p>
     <w:p>
       <w:pPr>
-        <w:pStyle w:val="Corpo"/>
+        <w:pStyle w:val="Corpo A"/>
         <w:spacing w:after="60"/>
         <w:ind w:left="227" w:firstLine="0"/>
       </w:pPr>
@@ -4785,7 +5116,7 @@
     </w:p>
     <w:p>
       <w:pPr>
-        <w:pStyle w:val="Corpo"/>
+        <w:pStyle w:val="Corpo A"/>
         <w:spacing w:after="60"/>
         <w:ind w:left="227" w:firstLine="0"/>
       </w:pPr>
@@ -4813,7 +5144,7 @@
     </w:p>
     <w:p>
       <w:pPr>
-        <w:pStyle w:val="Corpo"/>
+        <w:pStyle w:val="Corpo A"/>
         <w:spacing w:after="60"/>
         <w:ind w:left="227" w:firstLine="0"/>
       </w:pPr>
@@ -4855,7 +5186,7 @@
     </w:p>
     <w:p>
       <w:pPr>
-        <w:pStyle w:val="Corpo"/>
+        <w:pStyle w:val="Corpo A"/>
         <w:spacing w:after="60"/>
         <w:ind w:left="227" w:firstLine="0"/>
       </w:pPr>
@@ -4883,7 +5214,7 @@
     </w:p>
     <w:p>
       <w:pPr>
-        <w:pStyle w:val="Corpo"/>
+        <w:pStyle w:val="Corpo A"/>
         <w:spacing w:after="60"/>
         <w:ind w:left="227" w:firstLine="0"/>
       </w:pPr>
@@ -4925,7 +5256,7 @@
     </w:p>
     <w:p>
       <w:pPr>
-        <w:pStyle w:val="Corpo"/>
+        <w:pStyle w:val="Corpo A"/>
         <w:spacing w:after="60"/>
         <w:ind w:left="227" w:firstLine="0"/>
       </w:pPr>
@@ -4953,7 +5284,7 @@
     </w:p>
     <w:p>
       <w:pPr>
-        <w:pStyle w:val="Corpo"/>
+        <w:pStyle w:val="Corpo A"/>
         <w:spacing w:after="60"/>
         <w:ind w:left="227" w:firstLine="0"/>
       </w:pPr>
@@ -4967,7 +5298,7 @@
     </w:p>
     <w:p>
       <w:pPr>
-        <w:pStyle w:val="Corpo"/>
+        <w:pStyle w:val="Corpo A"/>
         <w:spacing w:after="60"/>
         <w:ind w:left="227" w:firstLine="0"/>
       </w:pPr>
@@ -5009,7 +5340,7 @@
     </w:p>
     <w:p>
       <w:pPr>
-        <w:pStyle w:val="Corpo"/>
+        <w:pStyle w:val="Corpo A"/>
         <w:spacing w:after="60"/>
       </w:pPr>
       <w:r>
@@ -5106,7 +5437,7 @@
     </w:p>
     <w:p>
       <w:pPr>
-        <w:pStyle w:val="Corpo"/>
+        <w:pStyle w:val="Corpo A"/>
         <w:spacing w:after="60"/>
       </w:pPr>
       <w:r>
@@ -5230,7 +5561,7 @@
     </w:p>
     <w:p>
       <w:pPr>
-        <w:pStyle w:val="Corpo"/>
+        <w:pStyle w:val="Corpo A"/>
         <w:spacing w:after="60"/>
       </w:pPr>
       <w:r>
@@ -5339,7 +5670,7 @@
     </w:p>
     <w:p>
       <w:pPr>
-        <w:pStyle w:val="Corpo"/>
+        <w:pStyle w:val="Corpo A"/>
         <w:spacing w:after="60"/>
       </w:pPr>
       <w:r>
@@ -5533,7 +5864,7 @@
     </w:p>
     <w:p>
       <w:pPr>
-        <w:pStyle w:val="Corpo"/>
+        <w:pStyle w:val="Corpo A"/>
         <w:spacing w:after="60"/>
       </w:pPr>
       <w:r>
@@ -5725,7 +6056,7 @@
     </w:p>
     <w:p>
       <w:pPr>
-        <w:pStyle w:val="Corpo"/>
+        <w:pStyle w:val="Corpo A"/>
         <w:spacing w:after="60"/>
       </w:pPr>
       <w:r>
@@ -5822,7 +6153,7 @@
     </w:p>
     <w:p>
       <w:pPr>
-        <w:pStyle w:val="Corpo"/>
+        <w:pStyle w:val="Corpo A"/>
         <w:spacing w:after="60"/>
       </w:pPr>
       <w:r>
@@ -5989,7 +6320,7 @@
     </w:p>
     <w:p>
       <w:pPr>
-        <w:pStyle w:val="Corpo"/>
+        <w:pStyle w:val="Corpo A"/>
         <w:spacing w:after="60"/>
       </w:pPr>
       <w:r>
@@ -6167,13 +6498,14 @@
           <w:b w:val="0"/>
           <w:bCs w:val="0"/>
           <w:rtl w:val="0"/>
+          <w:lang w:val="en-US"/>
         </w:rPr>
         <w:t>CIA</w:t>
       </w:r>
     </w:p>
     <w:p>
       <w:pPr>
-        <w:pStyle w:val="Corpo"/>
+        <w:pStyle w:val="Corpo A"/>
         <w:spacing w:after="60"/>
       </w:pPr>
       <w:r>
@@ -6270,7 +6602,7 @@
     </w:p>
     <w:p>
       <w:pPr>
-        <w:pStyle w:val="Corpo"/>
+        <w:pStyle w:val="Corpo A"/>
         <w:spacing w:after="60"/>
       </w:pPr>
       <w:r>
@@ -6380,7 +6712,7 @@
     </w:p>
     <w:p>
       <w:pPr>
-        <w:pStyle w:val="Corpo"/>
+        <w:pStyle w:val="Corpo A"/>
         <w:spacing w:after="60"/>
         <w:ind w:left="227" w:firstLine="0"/>
       </w:pPr>
@@ -6408,7 +6740,7 @@
     </w:p>
     <w:p>
       <w:pPr>
-        <w:pStyle w:val="Corpo"/>
+        <w:pStyle w:val="Corpo A"/>
         <w:spacing w:after="60"/>
         <w:ind w:left="227" w:firstLine="0"/>
       </w:pPr>
@@ -6422,7 +6754,7 @@
     </w:p>
     <w:p>
       <w:pPr>
-        <w:pStyle w:val="Corpo"/>
+        <w:pStyle w:val="Corpo A"/>
         <w:spacing w:after="60"/>
         <w:ind w:left="227" w:firstLine="0"/>
       </w:pPr>
@@ -6436,7 +6768,7 @@
     </w:p>
     <w:p>
       <w:pPr>
-        <w:pStyle w:val="Corpo"/>
+        <w:pStyle w:val="Corpo A"/>
         <w:spacing w:after="60"/>
         <w:ind w:left="227" w:firstLine="0"/>
       </w:pPr>
@@ -6464,7 +6796,7 @@
     </w:p>
     <w:p>
       <w:pPr>
-        <w:pStyle w:val="Corpo"/>
+        <w:pStyle w:val="Corpo A"/>
         <w:spacing w:after="60"/>
         <w:ind w:left="227" w:firstLine="0"/>
       </w:pPr>
@@ -6492,7 +6824,7 @@
     </w:p>
     <w:p>
       <w:pPr>
-        <w:pStyle w:val="Corpo"/>
+        <w:pStyle w:val="Corpo A"/>
         <w:spacing w:after="60"/>
         <w:ind w:left="227" w:firstLine="0"/>
       </w:pPr>
@@ -6589,7 +6921,7 @@
     </w:p>
     <w:p>
       <w:pPr>
-        <w:pStyle w:val="Corpo"/>
+        <w:pStyle w:val="Corpo A"/>
         <w:spacing w:after="60"/>
         <w:ind w:left="227" w:firstLine="0"/>
       </w:pPr>
@@ -6645,7 +6977,7 @@
     </w:p>
     <w:p>
       <w:pPr>
-        <w:pStyle w:val="Corpo"/>
+        <w:pStyle w:val="Corpo A"/>
         <w:spacing w:after="60"/>
         <w:ind w:left="227" w:firstLine="0"/>
       </w:pPr>
@@ -6673,7 +7005,7 @@
     </w:p>
     <w:p>
       <w:pPr>
-        <w:pStyle w:val="Corpo"/>
+        <w:pStyle w:val="Corpo A"/>
         <w:spacing w:after="60"/>
         <w:ind w:left="227" w:firstLine="0"/>
       </w:pPr>
@@ -6715,7 +7047,7 @@
     </w:p>
     <w:p>
       <w:pPr>
-        <w:pStyle w:val="Corpo"/>
+        <w:pStyle w:val="Corpo A"/>
         <w:spacing w:after="60"/>
         <w:ind w:left="227" w:firstLine="0"/>
       </w:pPr>
@@ -6743,7 +7075,7 @@
     </w:p>
     <w:p>
       <w:pPr>
-        <w:pStyle w:val="Corpo"/>
+        <w:pStyle w:val="Corpo A"/>
         <w:spacing w:after="60"/>
         <w:ind w:left="227" w:firstLine="0"/>
       </w:pPr>
@@ -6827,7 +7159,7 @@
     </w:p>
     <w:p>
       <w:pPr>
-        <w:pStyle w:val="Corpo"/>
+        <w:pStyle w:val="Corpo A"/>
         <w:spacing w:after="60"/>
         <w:ind w:left="227" w:firstLine="0"/>
       </w:pPr>
@@ -6909,7 +7241,7 @@
     </w:p>
     <w:p>
       <w:pPr>
-        <w:pStyle w:val="Corpo"/>
+        <w:pStyle w:val="Corpo A"/>
         <w:spacing w:after="60"/>
         <w:ind w:left="227" w:firstLine="0"/>
       </w:pPr>
@@ -6937,7 +7269,7 @@
     </w:p>
     <w:p>
       <w:pPr>
-        <w:pStyle w:val="Corpo"/>
+        <w:pStyle w:val="Corpo A"/>
         <w:spacing w:after="60"/>
         <w:ind w:left="227" w:firstLine="0"/>
       </w:pPr>
@@ -6993,7 +7325,7 @@
     </w:p>
     <w:p>
       <w:pPr>
-        <w:pStyle w:val="Corpo"/>
+        <w:pStyle w:val="Corpo A"/>
         <w:spacing w:after="60"/>
         <w:ind w:left="227" w:firstLine="0"/>
       </w:pPr>
@@ -7035,7 +7367,7 @@
     </w:p>
     <w:p>
       <w:pPr>
-        <w:pStyle w:val="Corpo"/>
+        <w:pStyle w:val="Corpo A"/>
         <w:spacing w:after="60"/>
       </w:pPr>
       <w:r>
@@ -7284,7 +7616,7 @@
     </w:p>
     <w:p>
       <w:pPr>
-        <w:pStyle w:val="Corpo"/>
+        <w:pStyle w:val="Corpo A"/>
         <w:spacing w:after="60"/>
       </w:pPr>
       <w:r>
@@ -7423,7 +7755,7 @@
     </w:p>
     <w:p>
       <w:pPr>
-        <w:pStyle w:val="Corpo"/>
+        <w:pStyle w:val="Corpo A"/>
         <w:spacing w:after="60"/>
       </w:pPr>
       <w:r>
@@ -7631,7 +7963,7 @@
     </w:p>
     <w:p>
       <w:pPr>
-        <w:pStyle w:val="Corpo"/>
+        <w:pStyle w:val="Corpo A"/>
         <w:spacing w:after="60"/>
       </w:pPr>
       <w:r>
@@ -7827,6 +8159,9 @@
     <w:p>
       <w:pPr>
         <w:pStyle w:val="Cabeçalho"/>
+        <w:rPr>
+          <w:lang w:val="de-DE"/>
+        </w:rPr>
       </w:pPr>
       <w:r>
         <w:rPr>
@@ -7840,7 +8175,7 @@
     </w:p>
     <w:p>
       <w:pPr>
-        <w:pStyle w:val="Corpo"/>
+        <w:pStyle w:val="Corpo A"/>
         <w:spacing w:after="60"/>
       </w:pPr>
       <w:r>
@@ -7867,7 +8202,7 @@
     </w:p>
     <w:p>
       <w:pPr>
-        <w:pStyle w:val="Corpo"/>
+        <w:pStyle w:val="Corpo A"/>
         <w:spacing w:after="60"/>
         <w:ind w:left="227" w:firstLine="0"/>
       </w:pPr>
@@ -7881,7 +8216,7 @@
     </w:p>
     <w:p>
       <w:pPr>
-        <w:pStyle w:val="Corpo"/>
+        <w:pStyle w:val="Corpo A"/>
         <w:spacing w:after="60"/>
         <w:ind w:left="227" w:firstLine="0"/>
       </w:pPr>
@@ -7895,7 +8230,7 @@
     </w:p>
     <w:p>
       <w:pPr>
-        <w:pStyle w:val="Corpo"/>
+        <w:pStyle w:val="Corpo A"/>
         <w:spacing w:after="60"/>
         <w:ind w:left="227" w:firstLine="0"/>
       </w:pPr>
@@ -7937,7 +8272,7 @@
     </w:p>
     <w:p>
       <w:pPr>
-        <w:pStyle w:val="Corpo"/>
+        <w:pStyle w:val="Corpo A"/>
         <w:spacing w:after="60"/>
         <w:ind w:left="227" w:firstLine="0"/>
       </w:pPr>
@@ -7965,7 +8300,7 @@
     </w:p>
     <w:p>
       <w:pPr>
-        <w:pStyle w:val="Corpo"/>
+        <w:pStyle w:val="Corpo A"/>
         <w:spacing w:after="60"/>
         <w:ind w:left="227" w:firstLine="0"/>
       </w:pPr>
@@ -8021,7 +8356,7 @@
     </w:p>
     <w:p>
       <w:pPr>
-        <w:pStyle w:val="Corpo"/>
+        <w:pStyle w:val="Corpo A"/>
         <w:spacing w:after="60"/>
         <w:ind w:left="227" w:firstLine="0"/>
       </w:pPr>
@@ -8049,7 +8384,7 @@
     </w:p>
     <w:p>
       <w:pPr>
-        <w:pStyle w:val="Corpo"/>
+        <w:pStyle w:val="Corpo A"/>
         <w:spacing w:after="60"/>
         <w:ind w:left="227" w:firstLine="0"/>
       </w:pPr>
@@ -8132,7 +8467,7 @@
     </w:p>
     <w:p>
       <w:pPr>
-        <w:pStyle w:val="Corpo"/>
+        <w:pStyle w:val="Corpo A"/>
         <w:spacing w:after="60"/>
         <w:ind w:left="227" w:firstLine="0"/>
       </w:pPr>
@@ -8258,7 +8593,7 @@
     </w:p>
     <w:p>
       <w:pPr>
-        <w:pStyle w:val="Corpo"/>
+        <w:pStyle w:val="Corpo A"/>
         <w:spacing w:after="60"/>
       </w:pPr>
       <w:r>
@@ -8327,7 +8662,7 @@
     </w:p>
     <w:p>
       <w:pPr>
-        <w:pStyle w:val="Corpo"/>
+        <w:pStyle w:val="Corpo A"/>
         <w:spacing w:after="60"/>
       </w:pPr>
       <w:r>
@@ -8406,13 +8741,14 @@
           <w:b w:val="0"/>
           <w:bCs w:val="0"/>
           <w:rtl w:val="0"/>
+          <w:lang w:val="en-US"/>
         </w:rPr>
         <w:t>DA</w:t>
       </w:r>
     </w:p>
     <w:p>
       <w:pPr>
-        <w:pStyle w:val="Corpo"/>
+        <w:pStyle w:val="Corpo A"/>
         <w:spacing w:after="60"/>
       </w:pPr>
       <w:r>
@@ -8467,7 +8803,7 @@
     </w:p>
     <w:p>
       <w:pPr>
-        <w:pStyle w:val="Corpo"/>
+        <w:pStyle w:val="Corpo A"/>
         <w:spacing w:after="60"/>
         <w:ind w:left="227" w:firstLine="0"/>
       </w:pPr>
@@ -8537,7 +8873,7 @@
     </w:p>
     <w:p>
       <w:pPr>
-        <w:pStyle w:val="Corpo"/>
+        <w:pStyle w:val="Corpo A"/>
         <w:spacing w:after="60"/>
         <w:ind w:left="227" w:firstLine="0"/>
       </w:pPr>
@@ -8551,7 +8887,7 @@
     </w:p>
     <w:p>
       <w:pPr>
-        <w:pStyle w:val="Corpo"/>
+        <w:pStyle w:val="Corpo A"/>
         <w:spacing w:after="60"/>
         <w:ind w:left="227" w:firstLine="0"/>
       </w:pPr>
@@ -8565,7 +8901,7 @@
     </w:p>
     <w:p>
       <w:pPr>
-        <w:pStyle w:val="Corpo"/>
+        <w:pStyle w:val="Corpo A"/>
         <w:spacing w:after="60"/>
         <w:ind w:left="227" w:firstLine="0"/>
       </w:pPr>
@@ -8593,7 +8929,7 @@
     </w:p>
     <w:p>
       <w:pPr>
-        <w:pStyle w:val="Corpo"/>
+        <w:pStyle w:val="Corpo A"/>
         <w:spacing w:after="60"/>
         <w:ind w:left="227" w:firstLine="0"/>
       </w:pPr>
@@ -8620,7 +8956,7 @@
     </w:p>
     <w:p>
       <w:pPr>
-        <w:pStyle w:val="Corpo"/>
+        <w:pStyle w:val="Corpo A"/>
         <w:spacing w:after="60"/>
         <w:ind w:left="227" w:firstLine="0"/>
       </w:pPr>
@@ -8634,7 +8970,7 @@
     </w:p>
     <w:p>
       <w:pPr>
-        <w:pStyle w:val="Corpo"/>
+        <w:pStyle w:val="Corpo A"/>
         <w:spacing w:after="60"/>
         <w:ind w:left="227" w:firstLine="0"/>
       </w:pPr>
@@ -8704,7 +9040,7 @@
     </w:p>
     <w:p>
       <w:pPr>
-        <w:pStyle w:val="Corpo"/>
+        <w:pStyle w:val="Corpo A"/>
         <w:spacing w:after="60"/>
       </w:pPr>
       <w:r>
@@ -8759,7 +9095,7 @@
     </w:p>
     <w:p>
       <w:pPr>
-        <w:pStyle w:val="Corpo"/>
+        <w:pStyle w:val="Corpo A"/>
         <w:spacing w:after="60"/>
       </w:pPr>
       <w:r>
@@ -8814,7 +9150,7 @@
     </w:p>
     <w:p>
       <w:pPr>
-        <w:pStyle w:val="Corpo"/>
+        <w:pStyle w:val="Corpo A"/>
         <w:spacing w:after="60"/>
       </w:pPr>
       <w:r>
@@ -8918,6 +9254,7 @@
           <w:b w:val="0"/>
           <w:bCs w:val="0"/>
           <w:rtl w:val="0"/>
+          <w:lang w:val="en-US"/>
         </w:rPr>
         <w:t>10. EXCLUS</w:t>
       </w:r>
@@ -8942,7 +9279,7 @@
     </w:p>
     <w:p>
       <w:pPr>
-        <w:pStyle w:val="Corpo"/>
+        <w:pStyle w:val="Corpo A"/>
         <w:spacing w:after="60"/>
       </w:pPr>
       <w:r>
@@ -8982,7 +9319,7 @@
     </w:p>
     <w:p>
       <w:pPr>
-        <w:pStyle w:val="Corpo"/>
+        <w:pStyle w:val="Corpo A"/>
         <w:spacing w:after="60"/>
         <w:ind w:left="227" w:firstLine="0"/>
       </w:pPr>
@@ -9010,7 +9347,7 @@
     </w:p>
     <w:p>
       <w:pPr>
-        <w:pStyle w:val="Corpo"/>
+        <w:pStyle w:val="Corpo A"/>
         <w:spacing w:after="60"/>
         <w:ind w:left="227" w:firstLine="0"/>
       </w:pPr>
@@ -9052,7 +9389,7 @@
     </w:p>
     <w:p>
       <w:pPr>
-        <w:pStyle w:val="Corpo"/>
+        <w:pStyle w:val="Corpo A"/>
         <w:spacing w:after="60"/>
         <w:ind w:left="227" w:firstLine="0"/>
       </w:pPr>
@@ -9066,7 +9403,7 @@
     </w:p>
     <w:p>
       <w:pPr>
-        <w:pStyle w:val="Corpo"/>
+        <w:pStyle w:val="Corpo A"/>
         <w:spacing w:after="60"/>
         <w:ind w:left="227" w:firstLine="0"/>
       </w:pPr>
@@ -9094,7 +9431,7 @@
     </w:p>
     <w:p>
       <w:pPr>
-        <w:pStyle w:val="Corpo"/>
+        <w:pStyle w:val="Corpo A"/>
         <w:spacing w:after="60"/>
         <w:ind w:left="227" w:firstLine="0"/>
       </w:pPr>
@@ -9108,7 +9445,7 @@
     </w:p>
     <w:p>
       <w:pPr>
-        <w:pStyle w:val="Corpo"/>
+        <w:pStyle w:val="Corpo A"/>
         <w:spacing w:after="60"/>
         <w:ind w:left="227" w:firstLine="0"/>
       </w:pPr>
@@ -9136,7 +9473,7 @@
     </w:p>
     <w:p>
       <w:pPr>
-        <w:pStyle w:val="Corpo"/>
+        <w:pStyle w:val="Corpo A"/>
         <w:spacing w:after="60"/>
         <w:ind w:left="227" w:firstLine="0"/>
       </w:pPr>
@@ -9234,7 +9571,7 @@
     </w:p>
     <w:p>
       <w:pPr>
-        <w:pStyle w:val="Corpo"/>
+        <w:pStyle w:val="Corpo A"/>
         <w:spacing w:after="60"/>
         <w:ind w:left="227" w:firstLine="0"/>
       </w:pPr>
@@ -9248,7 +9585,7 @@
     </w:p>
     <w:p>
       <w:pPr>
-        <w:pStyle w:val="Corpo"/>
+        <w:pStyle w:val="Corpo A"/>
         <w:spacing w:after="60"/>
         <w:ind w:left="227" w:firstLine="0"/>
       </w:pPr>
@@ -9276,7 +9613,7 @@
     </w:p>
     <w:p>
       <w:pPr>
-        <w:pStyle w:val="Corpo"/>
+        <w:pStyle w:val="Corpo A"/>
         <w:spacing w:after="60"/>
         <w:ind w:left="227" w:firstLine="0"/>
       </w:pPr>
@@ -9318,7 +9655,7 @@
     </w:p>
     <w:p>
       <w:pPr>
-        <w:pStyle w:val="Corpo"/>
+        <w:pStyle w:val="Corpo A"/>
         <w:spacing w:after="60"/>
         <w:ind w:left="227" w:firstLine="0"/>
       </w:pPr>
@@ -9360,7 +9697,7 @@
     </w:p>
     <w:p>
       <w:pPr>
-        <w:pStyle w:val="Corpo"/>
+        <w:pStyle w:val="Corpo A"/>
         <w:spacing w:after="60"/>
         <w:ind w:left="227" w:firstLine="0"/>
       </w:pPr>
@@ -9374,7 +9711,7 @@
     </w:p>
     <w:p>
       <w:pPr>
-        <w:pStyle w:val="Corpo"/>
+        <w:pStyle w:val="Corpo A"/>
         <w:spacing w:after="60"/>
         <w:ind w:left="227" w:firstLine="0"/>
       </w:pPr>
@@ -9388,7 +9725,7 @@
     </w:p>
     <w:p>
       <w:pPr>
-        <w:pStyle w:val="Corpo"/>
+        <w:pStyle w:val="Corpo A"/>
         <w:spacing w:after="60"/>
         <w:ind w:left="227" w:firstLine="0"/>
       </w:pPr>
@@ -9402,7 +9739,7 @@
     </w:p>
     <w:p>
       <w:pPr>
-        <w:pStyle w:val="Corpo"/>
+        <w:pStyle w:val="Corpo A"/>
         <w:spacing w:after="60"/>
         <w:ind w:left="227" w:firstLine="0"/>
       </w:pPr>
@@ -9430,7 +9767,7 @@
     </w:p>
     <w:p>
       <w:pPr>
-        <w:pStyle w:val="Corpo"/>
+        <w:pStyle w:val="Corpo A"/>
         <w:spacing w:after="60"/>
         <w:ind w:left="227" w:firstLine="0"/>
       </w:pPr>
@@ -9472,7 +9809,7 @@
     </w:p>
     <w:p>
       <w:pPr>
-        <w:pStyle w:val="Corpo"/>
+        <w:pStyle w:val="Corpo A"/>
         <w:spacing w:after="60"/>
         <w:ind w:left="227" w:firstLine="0"/>
       </w:pPr>
@@ -9541,7 +9878,7 @@
     </w:p>
     <w:p>
       <w:pPr>
-        <w:pStyle w:val="Corpo"/>
+        <w:pStyle w:val="Corpo A"/>
         <w:spacing w:after="60"/>
         <w:ind w:left="227" w:firstLine="0"/>
       </w:pPr>
@@ -9596,7 +9933,7 @@
     </w:p>
     <w:p>
       <w:pPr>
-        <w:pStyle w:val="Corpo"/>
+        <w:pStyle w:val="Corpo A"/>
         <w:spacing w:after="60"/>
         <w:ind w:left="227" w:firstLine="0"/>
       </w:pPr>
@@ -9624,7 +9961,7 @@
     </w:p>
     <w:p>
       <w:pPr>
-        <w:pStyle w:val="Corpo"/>
+        <w:pStyle w:val="Corpo A"/>
         <w:spacing w:after="60"/>
         <w:ind w:left="227" w:firstLine="0"/>
       </w:pPr>
@@ -9666,7 +10003,7 @@
     </w:p>
     <w:p>
       <w:pPr>
-        <w:pStyle w:val="Corpo"/>
+        <w:pStyle w:val="Corpo A"/>
         <w:spacing w:after="60"/>
         <w:ind w:left="227" w:firstLine="0"/>
       </w:pPr>
@@ -9694,7 +10031,7 @@
     </w:p>
     <w:p>
       <w:pPr>
-        <w:pStyle w:val="Corpo"/>
+        <w:pStyle w:val="Corpo A"/>
         <w:spacing w:after="60"/>
         <w:ind w:left="227" w:firstLine="0"/>
       </w:pPr>
@@ -9722,7 +10059,7 @@
     </w:p>
     <w:p>
       <w:pPr>
-        <w:pStyle w:val="Corpo"/>
+        <w:pStyle w:val="Corpo A"/>
         <w:spacing w:after="60"/>
         <w:ind w:left="227" w:firstLine="0"/>
       </w:pPr>
@@ -9791,7 +10128,7 @@
     </w:p>
     <w:p>
       <w:pPr>
-        <w:pStyle w:val="Corpo"/>
+        <w:pStyle w:val="Corpo A"/>
         <w:spacing w:after="60"/>
       </w:pPr>
       <w:r>
@@ -9931,13 +10268,14 @@
           <w:b w:val="0"/>
           <w:bCs w:val="0"/>
           <w:rtl w:val="0"/>
+          <w:lang w:val="en-US"/>
         </w:rPr>
         <w:t>NCIA</w:t>
       </w:r>
     </w:p>
     <w:p>
       <w:pPr>
-        <w:pStyle w:val="Corpo"/>
+        <w:pStyle w:val="Corpo A"/>
         <w:spacing w:after="60"/>
       </w:pPr>
       <w:r>
@@ -10034,7 +10372,7 @@
     </w:p>
     <w:p>
       <w:pPr>
-        <w:pStyle w:val="Corpo"/>
+        <w:pStyle w:val="Corpo A"/>
         <w:spacing w:after="60"/>
       </w:pPr>
       <w:r>
@@ -10075,7 +10413,7 @@
     </w:p>
     <w:p>
       <w:pPr>
-        <w:pStyle w:val="Corpo"/>
+        <w:pStyle w:val="Corpo A"/>
         <w:spacing w:after="60"/>
         <w:ind w:left="227" w:firstLine="0"/>
       </w:pPr>
@@ -10117,7 +10455,7 @@
     </w:p>
     <w:p>
       <w:pPr>
-        <w:pStyle w:val="Corpo"/>
+        <w:pStyle w:val="Corpo A"/>
         <w:spacing w:after="60"/>
         <w:ind w:left="227" w:firstLine="0"/>
       </w:pPr>
@@ -10158,7 +10496,7 @@
     </w:p>
     <w:p>
       <w:pPr>
-        <w:pStyle w:val="Corpo"/>
+        <w:pStyle w:val="Corpo A"/>
         <w:spacing w:after="60"/>
         <w:ind w:left="227" w:firstLine="0"/>
       </w:pPr>
@@ -10172,7 +10510,7 @@
     </w:p>
     <w:p>
       <w:pPr>
-        <w:pStyle w:val="Corpo"/>
+        <w:pStyle w:val="Corpo A"/>
         <w:spacing w:after="60"/>
         <w:ind w:left="227" w:firstLine="0"/>
       </w:pPr>
@@ -10186,7 +10524,7 @@
     </w:p>
     <w:p>
       <w:pPr>
-        <w:pStyle w:val="Corpo"/>
+        <w:pStyle w:val="Corpo A"/>
         <w:spacing w:after="60"/>
         <w:ind w:left="227" w:firstLine="0"/>
       </w:pPr>
@@ -10213,7 +10551,7 @@
     </w:p>
     <w:p>
       <w:pPr>
-        <w:pStyle w:val="Corpo"/>
+        <w:pStyle w:val="Corpo A"/>
         <w:spacing w:after="60"/>
         <w:ind w:left="227" w:firstLine="0"/>
       </w:pPr>
@@ -10241,7 +10579,7 @@
     </w:p>
     <w:p>
       <w:pPr>
-        <w:pStyle w:val="Corpo"/>
+        <w:pStyle w:val="Corpo A"/>
         <w:spacing w:after="60"/>
         <w:ind w:left="227" w:firstLine="0"/>
       </w:pPr>
@@ -10255,7 +10593,7 @@
     </w:p>
     <w:p>
       <w:pPr>
-        <w:pStyle w:val="Corpo"/>
+        <w:pStyle w:val="Corpo A"/>
         <w:spacing w:after="60"/>
         <w:ind w:left="227" w:firstLine="0"/>
       </w:pPr>
@@ -10297,7 +10635,7 @@
     </w:p>
     <w:p>
       <w:pPr>
-        <w:pStyle w:val="Corpo"/>
+        <w:pStyle w:val="Corpo A"/>
         <w:spacing w:after="60"/>
         <w:ind w:left="227" w:firstLine="0"/>
       </w:pPr>
@@ -10311,7 +10649,7 @@
     </w:p>
     <w:p>
       <w:pPr>
-        <w:pStyle w:val="Corpo"/>
+        <w:pStyle w:val="Corpo A"/>
         <w:spacing w:after="60"/>
       </w:pPr>
       <w:r>
@@ -10380,7 +10718,7 @@
     </w:p>
     <w:p>
       <w:pPr>
-        <w:pStyle w:val="Corpo"/>
+        <w:pStyle w:val="Corpo A"/>
         <w:spacing w:after="60"/>
       </w:pPr>
       <w:r>
@@ -10421,7 +10759,7 @@
     </w:p>
     <w:p>
       <w:pPr>
-        <w:pStyle w:val="Corpo"/>
+        <w:pStyle w:val="Corpo A"/>
         <w:spacing w:after="60"/>
       </w:pPr>
       <w:r>
@@ -10560,7 +10898,7 @@
     </w:p>
     <w:p>
       <w:pPr>
-        <w:pStyle w:val="Corpo"/>
+        <w:pStyle w:val="Corpo A"/>
         <w:spacing w:after="60"/>
       </w:pPr>
       <w:r>
@@ -10685,7 +11023,7 @@
     </w:p>
     <w:p>
       <w:pPr>
-        <w:pStyle w:val="Corpo"/>
+        <w:pStyle w:val="Corpo A"/>
         <w:spacing w:after="60"/>
       </w:pPr>
       <w:r>
@@ -10880,7 +11218,7 @@
     </w:p>
     <w:p>
       <w:pPr>
-        <w:pStyle w:val="Corpo"/>
+        <w:pStyle w:val="Corpo A"/>
         <w:spacing w:after="60"/>
       </w:pPr>
       <w:r>
@@ -11034,6 +11372,9 @@
     <w:p>
       <w:pPr>
         <w:pStyle w:val="Cabeçalho"/>
+        <w:rPr>
+          <w:lang w:val="de-DE"/>
+        </w:rPr>
       </w:pPr>
       <w:r>
         <w:rPr>
@@ -11047,7 +11388,7 @@
     </w:p>
     <w:p>
       <w:pPr>
-        <w:pStyle w:val="Corpo"/>
+        <w:pStyle w:val="Corpo A"/>
         <w:spacing w:after="60"/>
       </w:pPr>
       <w:r>
@@ -11088,7 +11429,7 @@
     </w:p>
     <w:p>
       <w:pPr>
-        <w:pStyle w:val="Corpo"/>
+        <w:pStyle w:val="Corpo A"/>
         <w:spacing w:after="60"/>
       </w:pPr>
       <w:r>
@@ -11143,7 +11484,7 @@
     </w:p>
     <w:p>
       <w:pPr>
-        <w:pStyle w:val="Corpo"/>
+        <w:pStyle w:val="Corpo A"/>
         <w:spacing w:after="60"/>
       </w:pPr>
       <w:r>
@@ -11244,7 +11585,7 @@
     </w:p>
     <w:p>
       <w:pPr>
-        <w:pStyle w:val="Corpo"/>
+        <w:pStyle w:val="Corpo A"/>
         <w:spacing w:after="60"/>
       </w:pPr>
       <w:r>
@@ -11313,7 +11654,7 @@
     </w:p>
     <w:p>
       <w:pPr>
-        <w:pStyle w:val="Corpo"/>
+        <w:pStyle w:val="Corpo A"/>
         <w:spacing w:after="60"/>
       </w:pPr>
       <w:r>
@@ -11354,7 +11695,7 @@
     </w:p>
     <w:p>
       <w:pPr>
-        <w:pStyle w:val="Corpo"/>
+        <w:pStyle w:val="Corpo A"/>
         <w:spacing w:after="60"/>
         <w:ind w:left="227" w:firstLine="0"/>
       </w:pPr>
@@ -11395,7 +11736,7 @@
     </w:p>
     <w:p>
       <w:pPr>
-        <w:pStyle w:val="Corpo"/>
+        <w:pStyle w:val="Corpo A"/>
         <w:spacing w:after="60"/>
         <w:ind w:left="227" w:firstLine="0"/>
       </w:pPr>
@@ -11409,7 +11750,7 @@
     </w:p>
     <w:p>
       <w:pPr>
-        <w:pStyle w:val="Corpo"/>
+        <w:pStyle w:val="Corpo A"/>
         <w:spacing w:after="60"/>
         <w:ind w:left="227" w:firstLine="0"/>
       </w:pPr>
@@ -11423,7 +11764,7 @@
     </w:p>
     <w:p>
       <w:pPr>
-        <w:pStyle w:val="Corpo"/>
+        <w:pStyle w:val="Corpo A"/>
         <w:spacing w:after="60"/>
         <w:ind w:left="227" w:firstLine="0"/>
       </w:pPr>
@@ -11450,7 +11791,7 @@
     </w:p>
     <w:p>
       <w:pPr>
-        <w:pStyle w:val="Corpo"/>
+        <w:pStyle w:val="Corpo A"/>
         <w:spacing w:after="60"/>
         <w:ind w:left="227" w:firstLine="0"/>
       </w:pPr>
@@ -11464,7 +11805,7 @@
     </w:p>
     <w:p>
       <w:pPr>
-        <w:pStyle w:val="Corpo"/>
+        <w:pStyle w:val="Corpo A"/>
         <w:spacing w:after="60"/>
         <w:ind w:left="227" w:firstLine="0"/>
       </w:pPr>
@@ -11506,7 +11847,7 @@
     </w:p>
     <w:p>
       <w:pPr>
-        <w:pStyle w:val="Corpo"/>
+        <w:pStyle w:val="Corpo A"/>
         <w:spacing w:after="60"/>
       </w:pPr>
       <w:r>
@@ -11540,6 +11881,7 @@
           <w:b w:val="0"/>
           <w:bCs w:val="0"/>
           <w:rtl w:val="0"/>
+          <w:lang w:val="en-US"/>
         </w:rPr>
         <w:t>14. VIG</w:t>
       </w:r>
@@ -11575,13 +11917,14 @@
           <w:b w:val="0"/>
           <w:bCs w:val="0"/>
           <w:rtl w:val="0"/>
+          <w:lang w:val="en-US"/>
         </w:rPr>
         <w:t>O</w:t>
       </w:r>
     </w:p>
     <w:p>
       <w:pPr>
-        <w:pStyle w:val="Corpo"/>
+        <w:pStyle w:val="Corpo A"/>
         <w:spacing w:after="60"/>
       </w:pPr>
       <w:r>
@@ -11621,7 +11964,7 @@
     </w:p>
     <w:p>
       <w:pPr>
-        <w:pStyle w:val="Corpo"/>
+        <w:pStyle w:val="Corpo A"/>
         <w:spacing w:after="60"/>
       </w:pPr>
       <w:r>
@@ -11676,7 +12019,7 @@
     </w:p>
     <w:p>
       <w:pPr>
-        <w:pStyle w:val="Corpo"/>
+        <w:pStyle w:val="Corpo A"/>
         <w:spacing w:after="60"/>
         <w:ind w:left="227" w:firstLine="0"/>
       </w:pPr>
@@ -11690,7 +12033,7 @@
     </w:p>
     <w:p>
       <w:pPr>
-        <w:pStyle w:val="Corpo"/>
+        <w:pStyle w:val="Corpo A"/>
         <w:spacing w:after="60"/>
         <w:ind w:left="227" w:firstLine="0"/>
       </w:pPr>
@@ -11731,7 +12074,7 @@
     </w:p>
     <w:p>
       <w:pPr>
-        <w:pStyle w:val="Corpo"/>
+        <w:pStyle w:val="Corpo A"/>
         <w:spacing w:after="60"/>
         <w:ind w:left="227" w:firstLine="0"/>
       </w:pPr>
@@ -11759,7 +12102,7 @@
     </w:p>
     <w:p>
       <w:pPr>
-        <w:pStyle w:val="Corpo"/>
+        <w:pStyle w:val="Corpo A"/>
         <w:spacing w:after="60"/>
         <w:ind w:left="227" w:firstLine="0"/>
       </w:pPr>
@@ -11815,7 +12158,7 @@
     </w:p>
     <w:p>
       <w:pPr>
-        <w:pStyle w:val="Corpo"/>
+        <w:pStyle w:val="Corpo A"/>
         <w:spacing w:after="60"/>
       </w:pPr>
       <w:r>
@@ -11898,7 +12241,7 @@
     </w:p>
     <w:p>
       <w:pPr>
-        <w:pStyle w:val="Corpo"/>
+        <w:pStyle w:val="Corpo A"/>
         <w:spacing w:after="60"/>
       </w:pPr>
       <w:r>
@@ -11945,6 +12288,7 @@
           <w:b w:val="0"/>
           <w:bCs w:val="0"/>
           <w:rtl w:val="0"/>
+          <w:lang w:val="en-US"/>
         </w:rPr>
         <w:t>15. SUSPENS</w:t>
       </w:r>
@@ -11969,7 +12313,7 @@
     </w:p>
     <w:p>
       <w:pPr>
-        <w:pStyle w:val="Corpo"/>
+        <w:pStyle w:val="Corpo A"/>
         <w:spacing w:after="60"/>
       </w:pPr>
       <w:r>
@@ -12010,7 +12354,7 @@
     </w:p>
     <w:p>
       <w:pPr>
-        <w:pStyle w:val="Corpo"/>
+        <w:pStyle w:val="Corpo A"/>
         <w:spacing w:after="60"/>
         <w:ind w:left="227" w:firstLine="0"/>
       </w:pPr>
@@ -12024,7 +12368,7 @@
     </w:p>
     <w:p>
       <w:pPr>
-        <w:pStyle w:val="Corpo"/>
+        <w:pStyle w:val="Corpo A"/>
         <w:spacing w:after="60"/>
         <w:ind w:left="227" w:firstLine="0"/>
       </w:pPr>
@@ -12052,7 +12396,7 @@
     </w:p>
     <w:p>
       <w:pPr>
-        <w:pStyle w:val="Corpo"/>
+        <w:pStyle w:val="Corpo A"/>
         <w:spacing w:after="60"/>
         <w:ind w:left="227" w:firstLine="0"/>
       </w:pPr>
@@ -12080,7 +12424,7 @@
     </w:p>
     <w:p>
       <w:pPr>
-        <w:pStyle w:val="Corpo"/>
+        <w:pStyle w:val="Corpo A"/>
         <w:spacing w:after="60"/>
         <w:ind w:left="227" w:firstLine="0"/>
       </w:pPr>
@@ -12094,7 +12438,7 @@
     </w:p>
     <w:p>
       <w:pPr>
-        <w:pStyle w:val="Corpo"/>
+        <w:pStyle w:val="Corpo A"/>
         <w:spacing w:after="60"/>
         <w:ind w:left="227" w:firstLine="0"/>
       </w:pPr>
@@ -12121,7 +12465,7 @@
     </w:p>
     <w:p>
       <w:pPr>
-        <w:pStyle w:val="Corpo"/>
+        <w:pStyle w:val="Corpo A"/>
         <w:spacing w:after="60"/>
         <w:ind w:left="227" w:firstLine="0"/>
       </w:pPr>
@@ -12163,7 +12507,7 @@
     </w:p>
     <w:p>
       <w:pPr>
-        <w:pStyle w:val="Corpo"/>
+        <w:pStyle w:val="Corpo A"/>
         <w:spacing w:after="60"/>
         <w:ind w:left="227" w:firstLine="0"/>
       </w:pPr>
@@ -12205,7 +12549,7 @@
     </w:p>
     <w:p>
       <w:pPr>
-        <w:pStyle w:val="Corpo"/>
+        <w:pStyle w:val="Corpo A"/>
         <w:spacing w:after="60"/>
       </w:pPr>
       <w:r>
@@ -12260,7 +12604,7 @@
     </w:p>
     <w:p>
       <w:pPr>
-        <w:pStyle w:val="Corpo"/>
+        <w:pStyle w:val="Corpo A"/>
         <w:spacing w:after="60"/>
       </w:pPr>
       <w:r>
@@ -12368,13 +12712,14 @@
           <w:b w:val="0"/>
           <w:bCs w:val="0"/>
           <w:rtl w:val="0"/>
+          <w:lang w:val="en-US"/>
         </w:rPr>
         <w:t>O</w:t>
       </w:r>
     </w:p>
     <w:p>
       <w:pPr>
-        <w:pStyle w:val="Corpo"/>
+        <w:pStyle w:val="Corpo A"/>
         <w:spacing w:after="60"/>
       </w:pPr>
       <w:r>
@@ -12401,7 +12746,7 @@
     </w:p>
     <w:p>
       <w:pPr>
-        <w:pStyle w:val="Corpo"/>
+        <w:pStyle w:val="Corpo A"/>
         <w:spacing w:after="60"/>
         <w:ind w:left="227" w:firstLine="0"/>
       </w:pPr>
@@ -12429,7 +12774,7 @@
     </w:p>
     <w:p>
       <w:pPr>
-        <w:pStyle w:val="Corpo"/>
+        <w:pStyle w:val="Corpo A"/>
         <w:spacing w:after="60"/>
         <w:ind w:left="227" w:firstLine="0"/>
       </w:pPr>
@@ -12443,7 +12788,7 @@
     </w:p>
     <w:p>
       <w:pPr>
-        <w:pStyle w:val="Corpo"/>
+        <w:pStyle w:val="Corpo A"/>
         <w:spacing w:after="60"/>
         <w:ind w:left="227" w:firstLine="0"/>
       </w:pPr>
@@ -12485,7 +12830,7 @@
     </w:p>
     <w:p>
       <w:pPr>
-        <w:pStyle w:val="Corpo"/>
+        <w:pStyle w:val="Corpo A"/>
         <w:spacing w:after="60"/>
         <w:ind w:left="227" w:firstLine="0"/>
       </w:pPr>
@@ -12513,7 +12858,7 @@
     </w:p>
     <w:p>
       <w:pPr>
-        <w:pStyle w:val="Corpo"/>
+        <w:pStyle w:val="Corpo A"/>
         <w:spacing w:after="60"/>
         <w:ind w:left="227" w:firstLine="0"/>
       </w:pPr>
@@ -12541,7 +12886,7 @@
     </w:p>
     <w:p>
       <w:pPr>
-        <w:pStyle w:val="Corpo"/>
+        <w:pStyle w:val="Corpo A"/>
         <w:spacing w:after="60"/>
         <w:ind w:left="227" w:firstLine="0"/>
       </w:pPr>
@@ -12555,7 +12900,7 @@
     </w:p>
     <w:p>
       <w:pPr>
-        <w:pStyle w:val="Corpo"/>
+        <w:pStyle w:val="Corpo A"/>
         <w:spacing w:after="60"/>
         <w:ind w:left="227" w:firstLine="0"/>
       </w:pPr>
@@ -12583,7 +12928,7 @@
     </w:p>
     <w:p>
       <w:pPr>
-        <w:pStyle w:val="Corpo"/>
+        <w:pStyle w:val="Corpo A"/>
         <w:spacing w:after="60"/>
         <w:ind w:left="227" w:firstLine="0"/>
       </w:pPr>
@@ -12611,7 +12956,7 @@
     </w:p>
     <w:p>
       <w:pPr>
-        <w:pStyle w:val="Corpo"/>
+        <w:pStyle w:val="Corpo A"/>
         <w:spacing w:after="60"/>
         <w:ind w:left="227" w:firstLine="0"/>
       </w:pPr>
@@ -12625,7 +12970,7 @@
     </w:p>
     <w:p>
       <w:pPr>
-        <w:pStyle w:val="Corpo"/>
+        <w:pStyle w:val="Corpo A"/>
         <w:spacing w:after="60"/>
       </w:pPr>
       <w:r>
@@ -12694,7 +13039,7 @@
     </w:p>
     <w:p>
       <w:pPr>
-        <w:pStyle w:val="Corpo"/>
+        <w:pStyle w:val="Corpo A"/>
         <w:spacing w:after="60"/>
       </w:pPr>
       <w:r>
@@ -12791,7 +13136,7 @@
     </w:p>
     <w:p>
       <w:pPr>
-        <w:pStyle w:val="Corpo"/>
+        <w:pStyle w:val="Corpo A"/>
         <w:spacing w:after="60"/>
       </w:pPr>
       <w:r>
@@ -12930,13 +13275,14 @@
           <w:b w:val="0"/>
           <w:bCs w:val="0"/>
           <w:rtl w:val="0"/>
+          <w:lang w:val="en-US"/>
         </w:rPr>
         <w:t>O</w:t>
       </w:r>
     </w:p>
     <w:p>
       <w:pPr>
-        <w:pStyle w:val="Corpo"/>
+        <w:pStyle w:val="Corpo A"/>
         <w:spacing w:after="60"/>
       </w:pPr>
       <w:r>
@@ -12991,7 +13337,7 @@
     </w:p>
     <w:p>
       <w:pPr>
-        <w:pStyle w:val="Corpo"/>
+        <w:pStyle w:val="Corpo A"/>
         <w:spacing w:after="60"/>
       </w:pPr>
       <w:r>
@@ -13018,7 +13364,7 @@
     </w:p>
     <w:p>
       <w:pPr>
-        <w:pStyle w:val="Corpo"/>
+        <w:pStyle w:val="Corpo A"/>
         <w:spacing w:after="60"/>
         <w:ind w:left="227" w:firstLine="0"/>
       </w:pPr>
@@ -13060,7 +13406,7 @@
     </w:p>
     <w:p>
       <w:pPr>
-        <w:pStyle w:val="Corpo"/>
+        <w:pStyle w:val="Corpo A"/>
         <w:spacing w:after="60"/>
         <w:ind w:left="227" w:firstLine="0"/>
       </w:pPr>
@@ -13116,7 +13462,7 @@
     </w:p>
     <w:p>
       <w:pPr>
-        <w:pStyle w:val="Corpo"/>
+        <w:pStyle w:val="Corpo A"/>
         <w:spacing w:after="60"/>
         <w:ind w:left="227" w:firstLine="0"/>
       </w:pPr>
@@ -13144,7 +13490,7 @@
     </w:p>
     <w:p>
       <w:pPr>
-        <w:pStyle w:val="Corpo"/>
+        <w:pStyle w:val="Corpo A"/>
         <w:spacing w:after="60"/>
         <w:ind w:left="227" w:firstLine="0"/>
       </w:pPr>
@@ -13172,7 +13518,7 @@
     </w:p>
     <w:p>
       <w:pPr>
-        <w:pStyle w:val="Corpo"/>
+        <w:pStyle w:val="Corpo A"/>
         <w:spacing w:after="60"/>
         <w:ind w:left="227" w:firstLine="0"/>
       </w:pPr>
@@ -13200,7 +13546,7 @@
     </w:p>
     <w:p>
       <w:pPr>
-        <w:pStyle w:val="Corpo"/>
+        <w:pStyle w:val="Corpo A"/>
         <w:spacing w:after="60"/>
         <w:ind w:left="227" w:firstLine="0"/>
       </w:pPr>
@@ -13228,7 +13574,7 @@
     </w:p>
     <w:p>
       <w:pPr>
-        <w:pStyle w:val="Corpo"/>
+        <w:pStyle w:val="Corpo A"/>
         <w:spacing w:after="60"/>
         <w:ind w:left="227" w:firstLine="0"/>
       </w:pPr>
@@ -13283,7 +13629,7 @@
     </w:p>
     <w:p>
       <w:pPr>
-        <w:pStyle w:val="Corpo"/>
+        <w:pStyle w:val="Corpo A"/>
         <w:spacing w:after="60"/>
         <w:ind w:left="227" w:firstLine="0"/>
       </w:pPr>
@@ -13325,7 +13671,7 @@
     </w:p>
     <w:p>
       <w:pPr>
-        <w:pStyle w:val="Corpo"/>
+        <w:pStyle w:val="Corpo A"/>
         <w:spacing w:after="60"/>
       </w:pPr>
       <w:r>
@@ -13426,7 +13772,7 @@
     </w:p>
     <w:p>
       <w:pPr>
-        <w:pStyle w:val="Corpo"/>
+        <w:pStyle w:val="Corpo A"/>
         <w:spacing w:after="60"/>
       </w:pPr>
       <w:r>
@@ -13550,7 +13896,7 @@
     </w:p>
     <w:p>
       <w:pPr>
-        <w:pStyle w:val="Corpo"/>
+        <w:pStyle w:val="Corpo A"/>
         <w:spacing w:after="60"/>
       </w:pPr>
       <w:r>
@@ -13744,7 +14090,7 @@
     </w:p>
     <w:p>
       <w:pPr>
-        <w:pStyle w:val="Corpo"/>
+        <w:pStyle w:val="Corpo A"/>
         <w:spacing w:after="60"/>
       </w:pPr>
       <w:r>
@@ -13799,7 +14145,7 @@
     </w:p>
     <w:p>
       <w:pPr>
-        <w:pStyle w:val="Corpo"/>
+        <w:pStyle w:val="Corpo A"/>
         <w:spacing w:after="60"/>
       </w:pPr>
       <w:r>
@@ -13927,7 +14273,7 @@
     </w:p>
     <w:p>
       <w:pPr>
-        <w:pStyle w:val="Corpo"/>
+        <w:pStyle w:val="Corpo A"/>
         <w:spacing w:after="60"/>
       </w:pPr>
       <w:r>
@@ -13995,7 +14341,7 @@
     </w:p>
     <w:p>
       <w:pPr>
-        <w:pStyle w:val="Corpo"/>
+        <w:pStyle w:val="Corpo A"/>
         <w:spacing w:after="60"/>
       </w:pPr>
       <w:r>
@@ -14134,7 +14480,7 @@
     </w:p>
     <w:p>
       <w:pPr>
-        <w:pStyle w:val="Corpo"/>
+        <w:pStyle w:val="Corpo A"/>
         <w:spacing w:after="60"/>
       </w:pPr>
       <w:r>
@@ -14203,7 +14549,7 @@
     </w:p>
     <w:p>
       <w:pPr>
-        <w:pStyle w:val="Corpo"/>
+        <w:pStyle w:val="Corpo A"/>
         <w:spacing w:after="60"/>
       </w:pPr>
       <w:r>
@@ -14279,6 +14625,7 @@
           <w:b w:val="0"/>
           <w:bCs w:val="0"/>
           <w:rtl w:val="0"/>
+          <w:lang w:val="en-US"/>
         </w:rPr>
         <w:t>20. LIMITA</w:t>
       </w:r>
@@ -14303,7 +14650,7 @@
     </w:p>
     <w:p>
       <w:pPr>
-        <w:pStyle w:val="Corpo"/>
+        <w:pStyle w:val="Corpo A"/>
         <w:spacing w:after="60"/>
       </w:pPr>
       <w:r>
@@ -14344,7 +14691,7 @@
     </w:p>
     <w:p>
       <w:pPr>
-        <w:pStyle w:val="Corpo"/>
+        <w:pStyle w:val="Corpo A"/>
         <w:spacing w:after="60"/>
       </w:pPr>
       <w:r>
@@ -14384,7 +14731,7 @@
     </w:p>
     <w:p>
       <w:pPr>
-        <w:pStyle w:val="Corpo"/>
+        <w:pStyle w:val="Corpo A"/>
         <w:spacing w:after="60"/>
         <w:ind w:left="227" w:firstLine="0"/>
       </w:pPr>
@@ -14412,7 +14759,7 @@
     </w:p>
     <w:p>
       <w:pPr>
-        <w:pStyle w:val="Corpo"/>
+        <w:pStyle w:val="Corpo A"/>
         <w:spacing w:after="60"/>
         <w:ind w:left="227" w:firstLine="0"/>
       </w:pPr>
@@ -14454,7 +14801,7 @@
     </w:p>
     <w:p>
       <w:pPr>
-        <w:pStyle w:val="Corpo"/>
+        <w:pStyle w:val="Corpo A"/>
         <w:spacing w:after="60"/>
         <w:ind w:left="227" w:firstLine="0"/>
       </w:pPr>
@@ -14482,7 +14829,7 @@
     </w:p>
     <w:p>
       <w:pPr>
-        <w:pStyle w:val="Corpo"/>
+        <w:pStyle w:val="Corpo A"/>
         <w:spacing w:after="60"/>
         <w:ind w:left="227" w:firstLine="0"/>
       </w:pPr>
@@ -14510,7 +14857,7 @@
     </w:p>
     <w:p>
       <w:pPr>
-        <w:pStyle w:val="Corpo"/>
+        <w:pStyle w:val="Corpo A"/>
         <w:spacing w:after="60"/>
         <w:ind w:left="227" w:firstLine="0"/>
       </w:pPr>
@@ -14538,7 +14885,7 @@
     </w:p>
     <w:p>
       <w:pPr>
-        <w:pStyle w:val="Corpo"/>
+        <w:pStyle w:val="Corpo A"/>
         <w:spacing w:after="60"/>
         <w:ind w:left="227" w:firstLine="0"/>
       </w:pPr>
@@ -14552,7 +14899,7 @@
     </w:p>
     <w:p>
       <w:pPr>
-        <w:pStyle w:val="Corpo"/>
+        <w:pStyle w:val="Corpo A"/>
         <w:spacing w:after="60"/>
         <w:ind w:left="227" w:firstLine="0"/>
       </w:pPr>
@@ -14566,7 +14913,7 @@
     </w:p>
     <w:p>
       <w:pPr>
-        <w:pStyle w:val="Corpo"/>
+        <w:pStyle w:val="Corpo A"/>
         <w:spacing w:after="60"/>
         <w:ind w:left="227" w:firstLine="0"/>
       </w:pPr>
@@ -14580,7 +14927,7 @@
     </w:p>
     <w:p>
       <w:pPr>
-        <w:pStyle w:val="Corpo"/>
+        <w:pStyle w:val="Corpo A"/>
         <w:spacing w:after="60"/>
         <w:ind w:left="227" w:firstLine="0"/>
       </w:pPr>
@@ -14594,7 +14941,7 @@
     </w:p>
     <w:p>
       <w:pPr>
-        <w:pStyle w:val="Corpo"/>
+        <w:pStyle w:val="Corpo A"/>
         <w:spacing w:after="60"/>
         <w:ind w:left="227" w:firstLine="0"/>
       </w:pPr>
@@ -14643,6 +14990,7 @@
           <w:b w:val="0"/>
           <w:bCs w:val="0"/>
           <w:rtl w:val="0"/>
+          <w:lang w:val="en-US"/>
         </w:rPr>
         <w:t>21. DISPOSI</w:t>
       </w:r>
@@ -14667,7 +15015,7 @@
     </w:p>
     <w:p>
       <w:pPr>
-        <w:pStyle w:val="Corpo"/>
+        <w:pStyle w:val="Corpo A"/>
         <w:spacing w:after="60"/>
       </w:pPr>
       <w:r>
@@ -14747,7 +15095,7 @@
     </w:p>
     <w:p>
       <w:pPr>
-        <w:pStyle w:val="Corpo"/>
+        <w:pStyle w:val="Corpo A"/>
         <w:spacing w:after="60"/>
       </w:pPr>
       <w:r>
@@ -14815,7 +15163,7 @@
     </w:p>
     <w:p>
       <w:pPr>
-        <w:pStyle w:val="Corpo"/>
+        <w:pStyle w:val="Corpo A"/>
         <w:spacing w:after="60"/>
       </w:pPr>
       <w:r>
@@ -14898,7 +15246,7 @@
     </w:p>
     <w:p>
       <w:pPr>
-        <w:pStyle w:val="Corpo"/>
+        <w:pStyle w:val="Corpo A"/>
         <w:spacing w:after="60"/>
       </w:pPr>
       <w:r>
@@ -14980,7 +15328,7 @@
     </w:p>
     <w:p>
       <w:pPr>
-        <w:pStyle w:val="Corpo"/>
+        <w:pStyle w:val="Corpo A"/>
         <w:spacing w:after="60"/>
       </w:pPr>
       <w:r>
@@ -15007,7 +15355,7 @@
     </w:p>
     <w:p>
       <w:pPr>
-        <w:pStyle w:val="Corpo"/>
+        <w:pStyle w:val="Corpo A"/>
         <w:spacing w:after="60"/>
       </w:pPr>
       <w:r>
@@ -15127,13 +15475,14 @@
           <w:b w:val="0"/>
           <w:bCs w:val="0"/>
           <w:rtl w:val="0"/>
+          <w:lang w:val="en-US"/>
         </w:rPr>
         <w:t>O</w:t>
       </w:r>
     </w:p>
     <w:p>
       <w:pPr>
-        <w:pStyle w:val="Corpo"/>
+        <w:pStyle w:val="Corpo A"/>
         <w:spacing w:after="60"/>
       </w:pPr>
       <w:r>
@@ -15284,7 +15633,7 @@
     </w:p>
     <w:p>
       <w:pPr>
-        <w:pStyle w:val="Corpo"/>
+        <w:pStyle w:val="Corpo A"/>
         <w:spacing w:after="60"/>
       </w:pPr>
       <w:r>
@@ -15436,7 +15785,7 @@
     </w:p>
     <w:p>
       <w:pPr>
-        <w:pStyle w:val="Corpo"/>
+        <w:pStyle w:val="Corpo A"/>
         <w:spacing w:after="60"/>
       </w:pPr>
       <w:r>
@@ -15519,7 +15868,7 @@
     </w:p>
     <w:p>
       <w:pPr>
-        <w:pStyle w:val="Corpo"/>
+        <w:pStyle w:val="Corpo A"/>
         <w:spacing w:after="60"/>
       </w:pPr>
       <w:r>
@@ -15588,7 +15937,7 @@
     </w:p>
     <w:p>
       <w:pPr>
-        <w:pStyle w:val="Corpo"/>
+        <w:pStyle w:val="Corpo A"/>
         <w:spacing w:after="60"/>
       </w:pPr>
       <w:r>
@@ -15685,7 +16034,7 @@
     </w:p>
     <w:p>
       <w:pPr>
-        <w:pStyle w:val="Corpo"/>
+        <w:pStyle w:val="Corpo A"/>
         <w:spacing w:after="60"/>
         <w:ind w:left="227" w:firstLine="0"/>
       </w:pPr>
@@ -15867,7 +16216,7 @@
     </w:p>
     <w:p>
       <w:pPr>
-        <w:pStyle w:val="Corpo"/>
+        <w:pStyle w:val="Corpo A"/>
         <w:spacing w:after="60"/>
       </w:pPr>
       <w:r>
@@ -15936,7 +16285,7 @@
     </w:p>
     <w:p>
       <w:pPr>
-        <w:pStyle w:val="Corpo"/>
+        <w:pStyle w:val="Corpo A"/>
         <w:spacing w:after="60"/>
         <w:ind w:left="227" w:firstLine="0"/>
       </w:pPr>
@@ -16146,7 +16495,7 @@
     </w:p>
     <w:p>
       <w:pPr>
-        <w:pStyle w:val="Corpo"/>
+        <w:pStyle w:val="Corpo A"/>
         <w:spacing w:after="60"/>
       </w:pPr>
       <w:r>
@@ -16451,7 +16800,7 @@
     </w:p>
     <w:p>
       <w:pPr>
-        <w:pStyle w:val="Corpo"/>
+        <w:pStyle w:val="Corpo A"/>
       </w:pPr>
       <w:r>
         <w:rPr>
@@ -16480,7 +16829,7 @@
     </w:p>
     <w:p>
       <w:pPr>
-        <w:pStyle w:val="Corpo"/>
+        <w:pStyle w:val="Corpo A"/>
         <w:spacing w:after="240"/>
       </w:pPr>
       <w:r>
@@ -16593,7 +16942,7 @@
       <w:tblPr>
         <w:tblW w:w="10370" w:type="dxa"/>
         <w:jc w:val="left"/>
-        <w:tblInd w:w="108" w:type="dxa"/>
+        <w:tblInd w:w="324" w:type="dxa"/>
         <w:tblBorders>
           <w:top w:val="single" w:color="ffffff" w:sz="8" w:space="0" w:shadow="0" w:frame="0"/>
           <w:left w:val="single" w:color="ffffff" w:sz="8" w:space="0" w:shadow="0" w:frame="0"/>
@@ -16635,7 +16984,7 @@
           </w:tcPr>
           <w:p>
             <w:pPr>
-              <w:pStyle w:val="Corpo"/>
+              <w:pStyle w:val="Corpo A"/>
               <w:spacing w:after="60"/>
               <w:rPr>
                 <w:shd w:val="nil" w:color="auto" w:fill="auto"/>
@@ -16652,7 +17001,7 @@
           </w:p>
           <w:p>
             <w:pPr>
-              <w:pStyle w:val="Corpo"/>
+              <w:pStyle w:val="Corpo A"/>
               <w:bidi w:val="0"/>
               <w:spacing w:after="60"/>
               <w:ind w:left="0" w:right="0" w:firstLine="0"/>
@@ -16673,7 +17022,7 @@
           </w:p>
           <w:p>
             <w:pPr>
-              <w:pStyle w:val="Corpo"/>
+              <w:pStyle w:val="Corpo A"/>
               <w:bidi w:val="0"/>
               <w:spacing w:after="60"/>
               <w:ind w:left="0" w:right="0" w:firstLine="0"/>
@@ -16696,7 +17045,7 @@
           </w:p>
           <w:p>
             <w:pPr>
-              <w:pStyle w:val="Corpo"/>
+              <w:pStyle w:val="Corpo A"/>
               <w:spacing w:after="60"/>
               <w:rPr>
                 <w:shd w:val="nil" w:color="auto" w:fill="auto"/>
@@ -16706,7 +17055,7 @@
           </w:p>
           <w:p>
             <w:pPr>
-              <w:pStyle w:val="Corpo"/>
+              <w:pStyle w:val="Corpo A"/>
               <w:bidi w:val="0"/>
               <w:spacing w:after="60"/>
               <w:ind w:left="0" w:right="0" w:firstLine="0"/>
@@ -16727,7 +17076,7 @@
           </w:p>
           <w:p>
             <w:pPr>
-              <w:pStyle w:val="Corpo"/>
+              <w:pStyle w:val="Corpo A"/>
               <w:spacing w:after="60"/>
               <w:rPr>
                 <w:shd w:val="nil" w:color="auto" w:fill="auto"/>
@@ -16737,7 +17086,7 @@
           </w:p>
           <w:p>
             <w:pPr>
-              <w:pStyle w:val="Corpo"/>
+              <w:pStyle w:val="Corpo A"/>
               <w:bidi w:val="0"/>
               <w:spacing w:after="60"/>
               <w:ind w:left="0" w:right="0" w:firstLine="0"/>
@@ -16758,7 +17107,7 @@
           </w:p>
           <w:p>
             <w:pPr>
-              <w:pStyle w:val="Corpo"/>
+              <w:pStyle w:val="Corpo A"/>
               <w:bidi w:val="0"/>
               <w:spacing w:after="60"/>
               <w:ind w:left="0" w:right="0" w:firstLine="0"/>
@@ -16801,7 +17150,7 @@
           </w:p>
           <w:p>
             <w:pPr>
-              <w:pStyle w:val="Corpo"/>
+              <w:pStyle w:val="Corpo A"/>
               <w:spacing w:after="60"/>
               <w:rPr>
                 <w:shd w:val="nil" w:color="auto" w:fill="auto"/>
@@ -16810,7 +17159,7 @@
           </w:p>
           <w:p>
             <w:pPr>
-              <w:pStyle w:val="Corpo"/>
+              <w:pStyle w:val="Corpo A"/>
               <w:spacing w:after="60"/>
               <w:rPr>
                 <w:shd w:val="nil" w:color="auto" w:fill="auto"/>
@@ -16820,7 +17169,7 @@
           </w:p>
           <w:p>
             <w:pPr>
-              <w:pStyle w:val="Corpo"/>
+              <w:pStyle w:val="Corpo A"/>
               <w:bidi w:val="0"/>
               <w:spacing w:after="60"/>
               <w:ind w:left="0" w:right="0" w:firstLine="0"/>
@@ -16841,7 +17190,7 @@
           </w:p>
           <w:p>
             <w:pPr>
-              <w:pStyle w:val="Corpo"/>
+              <w:pStyle w:val="Corpo A"/>
               <w:bidi w:val="0"/>
               <w:spacing w:after="60"/>
               <w:ind w:left="0" w:right="0" w:firstLine="0"/>
@@ -16852,13 +17201,11 @@
             </w:pPr>
             <w:r>
               <w:rPr>
-                <w:b w:val="1"/>
-                <w:bCs w:val="1"/>
                 <w:shd w:val="nil" w:color="auto" w:fill="auto"/>
                 <w:rtl w:val="0"/>
-                <w:lang w:val="en-US"/>
+                <w:lang w:val="pt-PT"/>
               </w:rPr>
-              <w:t>ADMINISTRADOR(A) / IMOBILI</w:t>
+              <w:t>{</w:t>
             </w:r>
             <w:r>
               <w:rPr>
@@ -16868,7 +17215,7 @@
                 <w:rtl w:val="0"/>
                 <w:lang w:val="en-US"/>
               </w:rPr>
-              <w:t>Á</w:t>
+              <w:t>partnerSignatureLabel</w:t>
             </w:r>
             <w:r>
               <w:rPr>
@@ -16876,9 +17223,9 @@
                 <w:bCs w:val="1"/>
                 <w:shd w:val="nil" w:color="auto" w:fill="auto"/>
                 <w:rtl w:val="0"/>
-                <w:lang w:val="en-US"/>
+                <w:lang w:val="pt-PT"/>
               </w:rPr>
-              <w:t>RIA</w:t>
+              <w:t>}</w:t>
             </w:r>
           </w:p>
         </w:tc>
@@ -16886,9 +17233,10 @@
     </w:tbl>
     <w:p>
       <w:pPr>
-        <w:pStyle w:val="Corpo"/>
+        <w:pStyle w:val="Corpo A"/>
         <w:widowControl w:val="0"/>
         <w:spacing w:after="240" w:line="240" w:lineRule="auto"/>
+        <w:ind w:left="216" w:hanging="216"/>
       </w:pPr>
       <w:r/>
     </w:p>
@@ -16938,32 +17286,19 @@
       <w:t xml:space="preserve">gina </w:t>
     </w:r>
     <w:r>
-      <w:rPr>
-        <w:rtl w:val="0"/>
-      </w:rPr>
+      <w:rPr/>
       <w:fldChar w:fldCharType="begin" w:fldLock="0"/>
     </w:r>
     <w:r>
-      <w:rPr>
-        <w:rtl w:val="0"/>
-      </w:rPr>
       <w:instrText xml:space="preserve"> PAGE </w:instrText>
     </w:r>
     <w:r>
-      <w:rPr>
-        <w:rtl w:val="0"/>
-      </w:rPr>
+      <w:rPr/>
       <w:fldChar w:fldCharType="separate" w:fldLock="0"/>
     </w:r>
+    <w:r/>
     <w:r>
-      <w:rPr>
-        <w:rtl w:val="0"/>
-      </w:rPr>
-    </w:r>
-    <w:r>
-      <w:rPr>
-        <w:rtl w:val="0"/>
-      </w:rPr>
+      <w:rPr/>
       <w:fldChar w:fldCharType="end" w:fldLock="0"/>
     </w:r>
     <w:r>
@@ -16976,32 +17311,19 @@
       <w:t xml:space="preserve"> de </w:t>
     </w:r>
     <w:r>
-      <w:rPr>
-        <w:rtl w:val="0"/>
-      </w:rPr>
+      <w:rPr/>
       <w:fldChar w:fldCharType="begin" w:fldLock="0"/>
     </w:r>
     <w:r>
-      <w:rPr>
-        <w:rtl w:val="0"/>
-      </w:rPr>
       <w:instrText xml:space="preserve"> NUMPAGES </w:instrText>
     </w:r>
     <w:r>
-      <w:rPr>
-        <w:rtl w:val="0"/>
-      </w:rPr>
+      <w:rPr/>
       <w:fldChar w:fldCharType="separate" w:fldLock="0"/>
     </w:r>
+    <w:r/>
     <w:r>
-      <w:rPr>
-        <w:rtl w:val="0"/>
-      </w:rPr>
-    </w:r>
-    <w:r>
-      <w:rPr>
-        <w:rtl w:val="0"/>
-      </w:rPr>
+      <w:rPr/>
       <w:fldChar w:fldCharType="end" w:fldLock="0"/>
     </w:r>
   </w:p>
@@ -17266,9 +17588,9 @@
       </w14:textFill>
     </w:rPr>
   </w:style>
-  <w:style w:type="paragraph" w:styleId="Corpo">
-    <w:name w:val="Corpo"/>
-    <w:next w:val="Corpo"/>
+  <w:style w:type="paragraph" w:styleId="Corpo A">
+    <w:name w:val="Corpo A"/>
+    <w:next w:val="Corpo A"/>
     <w:pPr>
       <w:keepNext w:val="0"/>
       <w:keepLines w:val="0"/>
@@ -17302,8 +17624,9 @@
       <w:u w:val="none" w:color="000000"/>
       <w:shd w:val="nil" w:color="auto" w:fill="auto"/>
       <w:vertAlign w:val="baseline"/>
-      <w14:textOutline>
+      <w14:textOutline w14:w="12700" w14:cap="flat">
         <w14:noFill/>
+        <w14:miter w14:lim="400000"/>
       </w14:textOutline>
       <w14:textFill>
         <w14:solidFill>
@@ -17314,7 +17637,7 @@
   </w:style>
   <w:style w:type="paragraph" w:styleId="Cabeçalho">
     <w:name w:val="Cabeçalho"/>
-    <w:next w:val="Corpo"/>
+    <w:next w:val="Corpo A"/>
     <w:pPr>
       <w:keepNext w:val="1"/>
       <w:keepLines w:val="1"/>
@@ -17349,8 +17672,9 @@
       <w:shd w:val="nil" w:color="auto" w:fill="auto"/>
       <w:vertAlign w:val="baseline"/>
       <w:lang w:val="en-US"/>
-      <w14:textOutline>
+      <w14:textOutline w14:w="12700" w14:cap="flat">
         <w14:noFill/>
+        <w14:miter w14:lim="400000"/>
       </w14:textOutline>
       <w14:textFill>
         <w14:solidFill>
@@ -17507,9 +17831,9 @@
         </a:effectStyle>
         <a:effectStyle>
           <a:effectLst>
-            <a:outerShdw sx="100000" sy="100000" kx="0" ky="0" algn="b" rotWithShape="0" blurRad="38100" dist="20000" dir="5400000">
+            <a:outerShdw sx="100000" sy="100000" kx="0" ky="0" algn="b" rotWithShape="0" blurRad="38100" dist="23000" dir="5400000">
               <a:srgbClr val="000000">
-                <a:alpha val="38000"/>
+                <a:alpha val="35000"/>
               </a:srgbClr>
             </a:outerShdw>
           </a:effectLst>
@@ -17589,7 +17913,7 @@
         </a:effectLst>
         <a:sp3d/>
       </a:spPr>
-      <a:bodyPr rot="0" spcFirstLastPara="1" vertOverflow="overflow" horzOverflow="overflow" vert="horz" wrap="square" lIns="45719" tIns="45719" rIns="45719" bIns="45719" numCol="1" spcCol="38100" rtlCol="0" anchor="ctr" upright="0">
+      <a:bodyPr rot="0" spcFirstLastPara="1" vertOverflow="overflow" horzOverflow="overflow" vert="horz" wrap="square" lIns="45718" tIns="45718" rIns="45718" bIns="45718" numCol="1" spcCol="38100" rtlCol="0" anchor="ctr" upright="0">
         <a:spAutoFit/>
       </a:bodyPr>
       <a:lstStyle>
@@ -17617,10 +17941,10 @@
             </a:solidFill>
             <a:effectLst/>
             <a:uFillTx/>
-            <a:latin typeface="Cambria"/>
-            <a:ea typeface="Cambria"/>
-            <a:cs typeface="Cambria"/>
-            <a:sym typeface="Cambria"/>
+            <a:latin typeface="+mn-lt"/>
+            <a:ea typeface="+mn-ea"/>
+            <a:cs typeface="+mn-cs"/>
+            <a:sym typeface="Helvetica Neue"/>
           </a:defRPr>
         </a:defPPr>
         <a:lvl1pPr marL="0" marR="0" indent="0" algn="l" defTabSz="914400" rtl="0" fontAlgn="auto" latinLnBrk="1" hangingPunct="0">
@@ -17876,9 +18200,9 @@
           <a:round/>
         </a:ln>
         <a:effectLst>
-          <a:outerShdw sx="100000" sy="100000" kx="0" ky="0" algn="b" rotWithShape="0" blurRad="38100" dist="20000" dir="5400000">
+          <a:outerShdw sx="100000" sy="100000" kx="0" ky="0" algn="b" rotWithShape="0" blurRad="38100" dist="23000" dir="5400000">
             <a:srgbClr val="000000">
-              <a:alpha val="38000"/>
+              <a:alpha val="35000"/>
             </a:srgbClr>
           </a:outerShdw>
         </a:effectLst>
@@ -18166,7 +18490,7 @@
         <a:effectLst/>
         <a:sp3d/>
       </a:spPr>
-      <a:bodyPr rot="0" spcFirstLastPara="1" vertOverflow="overflow" horzOverflow="overflow" vert="horz" wrap="square" lIns="45719" tIns="45719" rIns="45719" bIns="45719" numCol="1" spcCol="38100" rtlCol="0" anchor="t" upright="0">
+      <a:bodyPr rot="0" spcFirstLastPara="1" vertOverflow="overflow" horzOverflow="overflow" vert="horz" wrap="square" lIns="45718" tIns="45718" rIns="45718" bIns="45718" numCol="1" spcCol="38100" rtlCol="0" anchor="t" upright="0">
         <a:spAutoFit/>
       </a:bodyPr>
       <a:lstStyle>
@@ -18194,10 +18518,10 @@
             </a:solidFill>
             <a:effectLst/>
             <a:uFillTx/>
-            <a:latin typeface="Cambria"/>
-            <a:ea typeface="Cambria"/>
-            <a:cs typeface="Cambria"/>
-            <a:sym typeface="Cambria"/>
+            <a:latin typeface="+mn-lt"/>
+            <a:ea typeface="+mn-ea"/>
+            <a:cs typeface="+mn-cs"/>
+            <a:sym typeface="Helvetica Neue"/>
           </a:defRPr>
         </a:defPPr>
         <a:lvl1pPr marL="0" marR="0" indent="0" algn="l" defTabSz="914400" rtl="0" fontAlgn="auto" latinLnBrk="1" hangingPunct="0">

</xml_diff>